<commit_message>
Update Form 9 and Form 28 template files with support for {{SERVICE_...}} placeholders and principal details
</commit_message>
<xml_diff>
--- a/backend sp/demo/src/main/resources/Form28MAIN.docx
+++ b/backend sp/demo/src/main/resources/Form28MAIN.docx
@@ -1,6 +1,6 @@
 
 <file path=word/document.xml><?xml version="1.0" encoding="utf-8"?>
-<w:document xmlns:wpc="http://schemas.microsoft.com/office/word/2010/wordprocessingCanvas" xmlns:cx="http://schemas.microsoft.com/office/drawing/2014/chartex" xmlns:cx1="http://schemas.microsoft.com/office/drawing/2015/9/8/chartex" xmlns:cx2="http://schemas.microsoft.com/office/drawing/2015/10/21/chartex" xmlns:cx3="http://schemas.microsoft.com/office/drawing/2016/5/9/chartex" xmlns:cx4="http://schemas.microsoft.com/office/drawing/2016/5/10/chartex" xmlns:cx5="http://schemas.microsoft.com/office/drawing/2016/5/11/chartex" xmlns:cx6="http://schemas.microsoft.com/office/drawing/2016/5/12/chartex" xmlns:cx7="http://schemas.microsoft.com/office/drawing/2016/5/13/chartex" xmlns:cx8="http://schemas.microsoft.com/office/drawing/2016/5/14/chartex" xmlns:mc="http://schemas.openxmlformats.org/markup-compatibility/2006" xmlns:o="urn:schemas-microsoft-com:office:office" xmlns:r="http://schemas.openxmlformats.org/officeDocument/2006/relationships" xmlns:m="http://schemas.openxmlformats.org/officeDocument/2006/math" xmlns:v="urn:schemas-microsoft-com:vml" xmlns:wp14="http://schemas.microsoft.com/office/word/2010/wordprocessingDrawing" xmlns:wp="http://schemas.openxmlformats.org/drawingml/2006/wordprocessingDrawing" xmlns:w="http://schemas.openxmlformats.org/wordprocessingml/2006/main" xmlns:w14="http://schemas.microsoft.com/office/word/2010/wordml" xmlns:w10="urn:schemas-microsoft-com:office:word" xmlns:w15="http://schemas.microsoft.com/office/word/2012/wordml" xmlns:wpg="http://schemas.microsoft.com/office/word/2010/wordprocessingGroup" xmlns:wpi="http://schemas.microsoft.com/office/word/2010/wordprocessingInk" xmlns:wne="http://schemas.microsoft.com/office/word/2006/wordml" xmlns:wps="http://schemas.microsoft.com/office/word/2010/wordprocessingShape" xmlns:wpsCustomData="http://www.wps.cn/officeDocument/2013/wpsCustomData" mc:Ignorable="w14 w15 wp14">
+<w:document xmlns:wpc="http://schemas.microsoft.com/office/word/2010/wordprocessingCanvas" xmlns:cx="http://schemas.microsoft.com/office/drawing/2014/chartex" xmlns:cx1="http://schemas.microsoft.com/office/drawing/2015/9/8/chartex" xmlns:cx2="http://schemas.microsoft.com/office/drawing/2015/10/21/chartex" xmlns:cx3="http://schemas.microsoft.com/office/drawing/2016/5/9/chartex" xmlns:cx4="http://schemas.microsoft.com/office/drawing/2016/5/10/chartex" xmlns:cx5="http://schemas.microsoft.com/office/drawing/2016/5/11/chartex" xmlns:cx6="http://schemas.microsoft.com/office/drawing/2016/5/12/chartex" xmlns:cx7="http://schemas.microsoft.com/office/drawing/2016/5/13/chartex" xmlns:cx8="http://schemas.microsoft.com/office/drawing/2016/5/14/chartex" xmlns:mc="http://schemas.openxmlformats.org/markup-compatibility/2006" xmlns:aink="http://schemas.microsoft.com/office/drawing/2016/ink" xmlns:am3d="http://schemas.microsoft.com/office/drawing/2017/model3d" xmlns:o="urn:schemas-microsoft-com:office:office" xmlns:oel="http://schemas.microsoft.com/office/2019/extlst" xmlns:r="http://schemas.openxmlformats.org/officeDocument/2006/relationships" xmlns:m="http://schemas.openxmlformats.org/officeDocument/2006/math" xmlns:v="urn:schemas-microsoft-com:vml" xmlns:wp14="http://schemas.microsoft.com/office/word/2010/wordprocessingDrawing" xmlns:wp="http://schemas.openxmlformats.org/drawingml/2006/wordprocessingDrawing" xmlns:w10="urn:schemas-microsoft-com:office:word" xmlns:w="http://schemas.openxmlformats.org/wordprocessingml/2006/main" xmlns:w14="http://schemas.microsoft.com/office/word/2010/wordml" xmlns:w15="http://schemas.microsoft.com/office/word/2012/wordml" xmlns:w16cei="http://schemas.microsoft.com/office/word/2026/wordml/cei" xmlns:w16cex="http://schemas.microsoft.com/office/word/2018/wordml/cex" xmlns:w16cid="http://schemas.microsoft.com/office/word/2016/wordml/cid" xmlns:w16="http://schemas.microsoft.com/office/word/2018/wordml" xmlns:w16du="http://schemas.microsoft.com/office/word/2023/wordml/word16du" xmlns:w16sdtdh="http://schemas.microsoft.com/office/word/2020/wordml/sdtdatahash" xmlns:w16sdtfl="http://schemas.microsoft.com/office/word/2024/wordml/sdtformatlock" xmlns:w16se="http://schemas.microsoft.com/office/word/2015/wordml/symex" xmlns:wpg="http://schemas.microsoft.com/office/word/2010/wordprocessingGroup" xmlns:wpi="http://schemas.microsoft.com/office/word/2010/wordprocessingInk" xmlns:wne="http://schemas.microsoft.com/office/word/2006/wordml" xmlns:wps="http://schemas.microsoft.com/office/word/2010/wordprocessingShape" mc:Ignorable="w14 w15 w16se w16cid w16 w16cex w16sdtdh w16sdtfl w16du wp14">
   <w:body>
     <w:p>
       <w:pPr>
@@ -13,47 +13,29 @@
     </w:p>
     <w:tbl>
       <w:tblPr>
-        <w:tblStyle w:val="3"/>
         <w:tblW w:w="0" w:type="auto"/>
         <w:tblInd w:w="108" w:type="dxa"/>
         <w:tblBorders>
-          <w:top w:val="single" w:color="000000" w:sz="4" w:space="0"/>
-          <w:left w:val="single" w:color="000000" w:sz="4" w:space="0"/>
-          <w:bottom w:val="single" w:color="000000" w:sz="4" w:space="0"/>
-          <w:right w:val="single" w:color="000000" w:sz="4" w:space="0"/>
-          <w:insideH w:val="single" w:color="000000" w:sz="4" w:space="0"/>
-          <w:insideV w:val="single" w:color="000000" w:sz="4" w:space="0"/>
+          <w:top w:val="single" w:sz="4" w:space="0" w:color="000000"/>
+          <w:left w:val="single" w:sz="4" w:space="0" w:color="000000"/>
+          <w:bottom w:val="single" w:sz="4" w:space="0" w:color="000000"/>
+          <w:right w:val="single" w:sz="4" w:space="0" w:color="000000"/>
+          <w:insideH w:val="single" w:sz="4" w:space="0" w:color="000000"/>
+          <w:insideV w:val="single" w:sz="4" w:space="0" w:color="000000"/>
         </w:tblBorders>
         <w:tblLayout w:type="fixed"/>
         <w:tblCellMar>
-          <w:top w:w="0" w:type="dxa"/>
           <w:left w:w="0" w:type="dxa"/>
-          <w:bottom w:w="0" w:type="dxa"/>
           <w:right w:w="0" w:type="dxa"/>
         </w:tblCellMar>
+        <w:tblLook w:val="04A0" w:firstRow="1" w:lastRow="0" w:firstColumn="1" w:lastColumn="0" w:noHBand="0" w:noVBand="1"/>
       </w:tblPr>
       <w:tblGrid>
         <w:gridCol w:w="10567"/>
       </w:tblGrid>
       <w:tr>
-        <w:tblPrEx>
-          <w:tblBorders>
-            <w:top w:val="single" w:color="000000" w:sz="4" w:space="0"/>
-            <w:left w:val="single" w:color="000000" w:sz="4" w:space="0"/>
-            <w:bottom w:val="single" w:color="000000" w:sz="4" w:space="0"/>
-            <w:right w:val="single" w:color="000000" w:sz="4" w:space="0"/>
-            <w:insideH w:val="single" w:color="000000" w:sz="4" w:space="0"/>
-            <w:insideV w:val="single" w:color="000000" w:sz="4" w:space="0"/>
-          </w:tblBorders>
-          <w:tblCellMar>
-            <w:top w:w="0" w:type="dxa"/>
-            <w:left w:w="0" w:type="dxa"/>
-            <w:bottom w:w="0" w:type="dxa"/>
-            <w:right w:w="0" w:type="dxa"/>
-          </w:tblCellMar>
-        </w:tblPrEx>
         <w:trPr>
-          <w:trHeight w:val="2258" w:hRule="atLeast"/>
+          <w:trHeight w:val="2258"/>
         </w:trPr>
         <w:tc>
           <w:tcPr>
@@ -61,7 +43,7 @@
           </w:tcPr>
           <w:p>
             <w:pPr>
-              <w:pStyle w:val="6"/>
+              <w:pStyle w:val="TableParagraph"/>
               <w:spacing w:before="120" w:line="253" w:lineRule="exact"/>
               <w:ind w:left="4103" w:right="4086"/>
               <w:jc w:val="center"/>
@@ -101,7 +83,7 @@
           </w:p>
           <w:p>
             <w:pPr>
-              <w:pStyle w:val="6"/>
+              <w:pStyle w:val="TableParagraph"/>
               <w:ind w:left="4102" w:right="4086"/>
               <w:jc w:val="center"/>
               <w:rPr>
@@ -130,7 +112,7 @@
           </w:p>
           <w:p>
             <w:pPr>
-              <w:pStyle w:val="6"/>
+              <w:pStyle w:val="TableParagraph"/>
               <w:spacing w:line="251" w:lineRule="exact"/>
               <w:ind w:left="4102" w:right="4092"/>
               <w:jc w:val="center"/>
@@ -152,7 +134,7 @@
           </w:p>
           <w:p>
             <w:pPr>
-              <w:pStyle w:val="6"/>
+              <w:pStyle w:val="TableParagraph"/>
               <w:spacing w:before="1" w:line="252" w:lineRule="exact"/>
               <w:ind w:left="17" w:right="7"/>
               <w:jc w:val="center"/>
@@ -227,7 +209,7 @@
           </w:p>
           <w:p>
             <w:pPr>
-              <w:pStyle w:val="6"/>
+              <w:pStyle w:val="TableParagraph"/>
               <w:spacing w:line="252" w:lineRule="exact"/>
               <w:ind w:left="17" w:right="4"/>
               <w:jc w:val="center"/>
@@ -302,7 +284,7 @@
           </w:p>
           <w:p>
             <w:pPr>
-              <w:pStyle w:val="6"/>
+              <w:pStyle w:val="TableParagraph"/>
               <w:spacing w:line="252" w:lineRule="exact"/>
               <w:ind w:left="17" w:right="6"/>
               <w:jc w:val="center"/>
@@ -467,7 +449,7 @@
           </w:p>
           <w:p>
             <w:pPr>
-              <w:pStyle w:val="6"/>
+              <w:pStyle w:val="TableParagraph"/>
               <w:spacing w:line="252" w:lineRule="exact"/>
               <w:ind w:left="17"/>
               <w:jc w:val="center"/>
@@ -610,24 +592,8 @@
         </w:tc>
       </w:tr>
       <w:tr>
-        <w:tblPrEx>
-          <w:tblBorders>
-            <w:top w:val="single" w:color="000000" w:sz="4" w:space="0"/>
-            <w:left w:val="single" w:color="000000" w:sz="4" w:space="0"/>
-            <w:bottom w:val="single" w:color="000000" w:sz="4" w:space="0"/>
-            <w:right w:val="single" w:color="000000" w:sz="4" w:space="0"/>
-            <w:insideH w:val="single" w:color="000000" w:sz="4" w:space="0"/>
-            <w:insideV w:val="single" w:color="000000" w:sz="4" w:space="0"/>
-          </w:tblBorders>
-          <w:tblCellMar>
-            <w:top w:w="0" w:type="dxa"/>
-            <w:left w:w="0" w:type="dxa"/>
-            <w:bottom w:w="0" w:type="dxa"/>
-            <w:right w:w="0" w:type="dxa"/>
-          </w:tblCellMar>
-        </w:tblPrEx>
         <w:trPr>
-          <w:trHeight w:val="3266" w:hRule="atLeast"/>
+          <w:trHeight w:val="3266"/>
         </w:trPr>
         <w:tc>
           <w:tcPr>
@@ -635,7 +601,7 @@
           </w:tcPr>
           <w:p>
             <w:pPr>
-              <w:pStyle w:val="6"/>
+              <w:pStyle w:val="TableParagraph"/>
               <w:spacing w:before="120"/>
               <w:ind w:left="122"/>
               <w:rPr>
@@ -725,7 +691,7 @@
           </w:p>
           <w:p>
             <w:pPr>
-              <w:pStyle w:val="6"/>
+              <w:pStyle w:val="TableParagraph"/>
               <w:spacing w:before="120"/>
               <w:ind w:left="122"/>
               <w:rPr>
@@ -737,24 +703,10 @@
           </w:p>
           <w:tbl>
             <w:tblPr>
-              <w:tblStyle w:val="4"/>
+              <w:tblStyle w:val="TableGrid"/>
               <w:tblW w:w="0" w:type="auto"/>
-              <w:tblInd w:w="0" w:type="dxa"/>
-              <w:tblBorders>
-                <w:top w:val="single" w:color="auto" w:sz="4" w:space="0"/>
-                <w:left w:val="single" w:color="auto" w:sz="4" w:space="0"/>
-                <w:bottom w:val="single" w:color="auto" w:sz="4" w:space="0"/>
-                <w:right w:val="single" w:color="auto" w:sz="4" w:space="0"/>
-                <w:insideH w:val="single" w:color="auto" w:sz="4" w:space="0"/>
-                <w:insideV w:val="single" w:color="auto" w:sz="4" w:space="0"/>
-              </w:tblBorders>
               <w:tblLayout w:type="fixed"/>
-              <w:tblCellMar>
-                <w:top w:w="0" w:type="dxa"/>
-                <w:left w:w="108" w:type="dxa"/>
-                <w:bottom w:w="0" w:type="dxa"/>
-                <w:right w:w="108" w:type="dxa"/>
-              </w:tblCellMar>
+              <w:tblLook w:val="04A0" w:firstRow="1" w:lastRow="0" w:firstColumn="1" w:lastColumn="0" w:noHBand="0" w:noVBand="1"/>
             </w:tblPr>
             <w:tblGrid>
               <w:gridCol w:w="3519"/>
@@ -762,24 +714,8 @@
               <w:gridCol w:w="3519"/>
             </w:tblGrid>
             <w:tr>
-              <w:tblPrEx>
-                <w:tblBorders>
-                  <w:top w:val="single" w:color="auto" w:sz="4" w:space="0"/>
-                  <w:left w:val="single" w:color="auto" w:sz="4" w:space="0"/>
-                  <w:bottom w:val="single" w:color="auto" w:sz="4" w:space="0"/>
-                  <w:right w:val="single" w:color="auto" w:sz="4" w:space="0"/>
-                  <w:insideH w:val="single" w:color="auto" w:sz="4" w:space="0"/>
-                  <w:insideV w:val="single" w:color="auto" w:sz="4" w:space="0"/>
-                </w:tblBorders>
-                <w:tblCellMar>
-                  <w:top w:w="0" w:type="dxa"/>
-                  <w:left w:w="108" w:type="dxa"/>
-                  <w:bottom w:w="0" w:type="dxa"/>
-                  <w:right w:w="108" w:type="dxa"/>
-                </w:tblCellMar>
-              </w:tblPrEx>
               <w:trPr>
-                <w:trHeight w:val="481" w:hRule="atLeast"/>
+                <w:trHeight w:val="481"/>
               </w:trPr>
               <w:tc>
                 <w:tcPr>
@@ -787,38 +723,28 @@
                 </w:tcPr>
                 <w:p>
                   <w:pPr>
-                    <w:pStyle w:val="6"/>
-                    <w:jc w:val="both"/>
+                    <w:pStyle w:val="TableParagraph"/>
                     <w:rPr>
-                      <w:rFonts w:hint="default" w:ascii="Times New Roman"/>
-                      <w:vertAlign w:val="baseline"/>
-                      <w:lang w:val="en-US"/>
+                      <w:rFonts w:ascii="Times New Roman"/>
                     </w:rPr>
                   </w:pPr>
                   <w:r>
                     <w:rPr>
-                      <w:rFonts w:hint="default" w:ascii="Times New Roman"/>
-                      <w:vertAlign w:val="baseline"/>
-                      <w:lang w:val="en-US"/>
+                      <w:rFonts w:ascii="Times New Roman"/>
                     </w:rPr>
                     <w:t xml:space="preserve"> </w:t>
                   </w:r>
                 </w:p>
                 <w:p>
                   <w:pPr>
-                    <w:pStyle w:val="6"/>
-                    <w:jc w:val="both"/>
+                    <w:pStyle w:val="TableParagraph"/>
                     <w:rPr>
-                      <w:rFonts w:hint="default" w:ascii="Times New Roman"/>
-                      <w:vertAlign w:val="baseline"/>
-                      <w:lang w:val="en-US"/>
+                      <w:rFonts w:ascii="Times New Roman"/>
                     </w:rPr>
                   </w:pPr>
                   <w:r>
                     <w:rPr>
-                      <w:rFonts w:hint="default" w:ascii="Times New Roman"/>
-                      <w:vertAlign w:val="baseline"/>
-                      <w:lang w:val="en-US"/>
+                      <w:rFonts w:ascii="Times New Roman"/>
                     </w:rPr>
                     <w:t xml:space="preserve">     Name </w:t>
                   </w:r>
@@ -830,29 +756,22 @@
                 </w:tcPr>
                 <w:p>
                   <w:pPr>
-                    <w:pStyle w:val="6"/>
-                    <w:jc w:val="both"/>
+                    <w:pStyle w:val="TableParagraph"/>
                     <w:rPr>
                       <w:rFonts w:ascii="Times New Roman"/>
-                      <w:vertAlign w:val="baseline"/>
                     </w:rPr>
                   </w:pPr>
                 </w:p>
                 <w:p>
                   <w:pPr>
-                    <w:pStyle w:val="6"/>
-                    <w:jc w:val="both"/>
+                    <w:pStyle w:val="TableParagraph"/>
                     <w:rPr>
-                      <w:rFonts w:hint="default" w:ascii="Times New Roman"/>
-                      <w:vertAlign w:val="baseline"/>
-                      <w:lang w:val="en-US"/>
+                      <w:rFonts w:ascii="Times New Roman"/>
                     </w:rPr>
                   </w:pPr>
                   <w:r>
                     <w:rPr>
-                      <w:rFonts w:hint="default" w:ascii="Times New Roman"/>
-                      <w:vertAlign w:val="baseline"/>
-                      <w:lang w:val="en-US"/>
+                      <w:rFonts w:ascii="Times New Roman"/>
                     </w:rPr>
                     <w:t xml:space="preserve">  Nationality </w:t>
                   </w:r>
@@ -864,38 +783,28 @@
                 </w:tcPr>
                 <w:p>
                   <w:pPr>
-                    <w:pStyle w:val="6"/>
-                    <w:jc w:val="both"/>
+                    <w:pStyle w:val="TableParagraph"/>
                     <w:rPr>
-                      <w:rFonts w:hint="default" w:ascii="Times New Roman"/>
-                      <w:vertAlign w:val="baseline"/>
-                      <w:lang w:val="en-US"/>
+                      <w:rFonts w:ascii="Times New Roman"/>
                     </w:rPr>
                   </w:pPr>
                   <w:r>
                     <w:rPr>
-                      <w:rFonts w:hint="default" w:ascii="Times New Roman"/>
-                      <w:vertAlign w:val="baseline"/>
-                      <w:lang w:val="en-US"/>
+                      <w:rFonts w:ascii="Times New Roman"/>
                     </w:rPr>
                     <w:t xml:space="preserve">   </w:t>
                   </w:r>
                 </w:p>
                 <w:p>
                   <w:pPr>
-                    <w:pStyle w:val="6"/>
-                    <w:jc w:val="both"/>
+                    <w:pStyle w:val="TableParagraph"/>
                     <w:rPr>
-                      <w:rFonts w:hint="default" w:ascii="Times New Roman"/>
-                      <w:vertAlign w:val="baseline"/>
-                      <w:lang w:val="en-US"/>
+                      <w:rFonts w:ascii="Times New Roman"/>
                     </w:rPr>
                   </w:pPr>
                   <w:r>
                     <w:rPr>
-                      <w:rFonts w:hint="default" w:ascii="Times New Roman"/>
-                      <w:vertAlign w:val="baseline"/>
-                      <w:lang w:val="en-US"/>
+                      <w:rFonts w:ascii="Times New Roman"/>
                     </w:rPr>
                     <w:t xml:space="preserve">      Address</w:t>
                   </w:r>
@@ -903,24 +812,8 @@
               </w:tc>
             </w:tr>
             <w:tr>
-              <w:tblPrEx>
-                <w:tblBorders>
-                  <w:top w:val="single" w:color="auto" w:sz="4" w:space="0"/>
-                  <w:left w:val="single" w:color="auto" w:sz="4" w:space="0"/>
-                  <w:bottom w:val="single" w:color="auto" w:sz="4" w:space="0"/>
-                  <w:right w:val="single" w:color="auto" w:sz="4" w:space="0"/>
-                  <w:insideH w:val="single" w:color="auto" w:sz="4" w:space="0"/>
-                  <w:insideV w:val="single" w:color="auto" w:sz="4" w:space="0"/>
-                </w:tblBorders>
-                <w:tblCellMar>
-                  <w:top w:w="0" w:type="dxa"/>
-                  <w:left w:w="108" w:type="dxa"/>
-                  <w:bottom w:w="0" w:type="dxa"/>
-                  <w:right w:w="108" w:type="dxa"/>
-                </w:tblCellMar>
-              </w:tblPrEx>
               <w:trPr>
-                <w:trHeight w:val="1440" w:hRule="atLeast"/>
+                <w:trHeight w:val="1440"/>
               </w:trPr>
               <w:tc>
                 <w:tcPr>
@@ -928,40 +821,72 @@
                 </w:tcPr>
                 <w:p>
                   <w:pPr>
-                    <w:pStyle w:val="6"/>
-                    <w:jc w:val="both"/>
+                    <w:pStyle w:val="TableParagraph"/>
                     <w:rPr>
-                      <w:rFonts w:hint="default" w:ascii="Times New Roman"/>
-                      <w:vertAlign w:val="baseline"/>
-                      <w:lang w:val="en-US"/>
+                      <w:rFonts w:ascii="Times New Roman"/>
                     </w:rPr>
                   </w:pPr>
                   <w:r>
                     <w:rPr>
-                      <w:rFonts w:hint="default" w:ascii="Times New Roman"/>
-                      <w:vertAlign w:val="baseline"/>
-                      <w:lang w:val="en-US"/>
+                      <w:rFonts w:ascii="Times New Roman"/>
                     </w:rPr>
                     <w:t xml:space="preserve">   </w:t>
                   </w:r>
                 </w:p>
                 <w:p>
                   <w:pPr>
-                    <w:pStyle w:val="6"/>
-                    <w:jc w:val="both"/>
+                    <w:pStyle w:val="TableParagraph"/>
+                    <w:spacing w:before="38"/>
                     <w:rPr>
-                      <w:rFonts w:hint="default" w:ascii="Times New Roman"/>
-                      <w:vertAlign w:val="baseline"/>
-                      <w:lang w:val="en-US"/>
+                      <w:rFonts w:ascii="Calibri" w:hAnsi="Calibri" w:cs="Calibri"/>
+                      <w:bCs/>
+                      <w:sz w:val="18"/>
+                      <w:szCs w:val="18"/>
                     </w:rPr>
                   </w:pPr>
                   <w:r>
                     <w:rPr>
-                      <w:rFonts w:hint="default" w:ascii="Times New Roman"/>
-                      <w:vertAlign w:val="baseline"/>
-                      <w:lang w:val="en-US"/>
+                      <w:rFonts w:ascii="Calibri" w:hAnsi="Calibri" w:cs="Calibri"/>
+                      <w:bCs/>
+                      <w:sz w:val="18"/>
+                      <w:szCs w:val="18"/>
                     </w:rPr>
-                    <w:t xml:space="preserve">    {principal}</w:t>
+                    <w:t>{{SERVICE_NAME}}</w:t>
+                  </w:r>
+                </w:p>
+                <w:p>
+                  <w:pPr>
+                    <w:pStyle w:val="TableParagraph"/>
+                    <w:rPr>
+                      <w:rFonts w:ascii="Times New Roman"/>
+                    </w:rPr>
+                  </w:pPr>
+                </w:p>
+              </w:tc>
+              <w:tc>
+                <w:tcPr>
+                  <w:tcW w:w="3519" w:type="dxa"/>
+                </w:tcPr>
+                <w:p>
+                  <w:pPr>
+                    <w:pStyle w:val="TableParagraph"/>
+                    <w:rPr>
+                      <w:rFonts w:ascii="Times New Roman"/>
+                    </w:rPr>
+                  </w:pPr>
+                </w:p>
+                <w:p>
+                  <w:pPr>
+                    <w:pStyle w:val="TableParagraph"/>
+                    <w:rPr>
+                      <w:rFonts w:ascii="Times New Roman"/>
+                    </w:rPr>
+                  </w:pPr>
+                  <w:r>
+                    <w:rPr>
+                      <w:rFonts w:ascii="Times New Roman"/>
+                    </w:rPr>
+                    <w:t>{nation}</w:t>
                   </w:r>
                 </w:p>
               </w:tc>
@@ -971,78 +896,133 @@
                 </w:tcPr>
                 <w:p>
                   <w:pPr>
-                    <w:pStyle w:val="6"/>
-                    <w:jc w:val="both"/>
+                    <w:pStyle w:val="TableParagraph"/>
+                    <w:spacing w:before="38"/>
                     <w:rPr>
-                      <w:rFonts w:ascii="Times New Roman"/>
-                      <w:vertAlign w:val="baseline"/>
-                    </w:rPr>
-                  </w:pPr>
-                </w:p>
-                <w:p>
-                  <w:pPr>
-                    <w:pStyle w:val="6"/>
-                    <w:jc w:val="both"/>
-                    <w:rPr>
-                      <w:rFonts w:hint="default" w:ascii="Times New Roman"/>
-                      <w:vertAlign w:val="baseline"/>
-                      <w:lang w:val="en-US"/>
+                      <w:rFonts w:ascii="Calibri" w:hAnsi="Calibri" w:cs="Calibri"/>
+                      <w:bCs/>
+                      <w:sz w:val="18"/>
+                      <w:szCs w:val="18"/>
                     </w:rPr>
                   </w:pPr>
                   <w:r>
                     <w:rPr>
-                      <w:rFonts w:hint="default" w:ascii="Times New Roman"/>
-                      <w:vertAlign w:val="baseline"/>
-                      <w:lang w:val="en-US"/>
+                      <w:rFonts w:ascii="Calibri" w:hAnsi="Calibri" w:cs="Calibri"/>
+                      <w:bCs/>
+                      <w:sz w:val="18"/>
+                      <w:szCs w:val="18"/>
                     </w:rPr>
-                    <w:t>{nation}</w:t>
+                    <w:t>{{SERVICE_NAME}}</w:t>
                   </w:r>
-                  <w:bookmarkStart w:id="0" w:name="_GoBack"/>
-                  <w:bookmarkEnd w:id="0"/>
-                </w:p>
-              </w:tc>
-              <w:tc>
-                <w:tcPr>
-                  <w:tcW w:w="3519" w:type="dxa"/>
-                </w:tcPr>
-                <w:p>
-                  <w:pPr>
-                    <w:pStyle w:val="6"/>
-                    <w:jc w:val="both"/>
-                    <w:rPr>
-                      <w:rFonts w:ascii="Times New Roman"/>
-                      <w:vertAlign w:val="baseline"/>
-                    </w:rPr>
-                  </w:pPr>
                 </w:p>
                 <w:p>
                   <w:pPr>
-                    <w:pStyle w:val="6"/>
-                    <w:jc w:val="both"/>
+                    <w:pStyle w:val="TableParagraph"/>
+                    <w:spacing w:before="38"/>
                     <w:rPr>
-                      <w:rFonts w:hint="default" w:ascii="Times New Roman"/>
-                      <w:vertAlign w:val="baseline"/>
-                      <w:lang w:val="en-US"/>
+                      <w:rFonts w:ascii="Calibri" w:hAnsi="Calibri" w:cs="Calibri"/>
+                      <w:bCs/>
+                      <w:sz w:val="18"/>
+                      <w:szCs w:val="18"/>
                     </w:rPr>
                   </w:pPr>
                   <w:r>
                     <w:rPr>
-                      <w:rFonts w:hint="default" w:ascii="Calibri" w:hAnsi="Calibri" w:cs="Calibri"/>
-                      <w:b/>
-                      <w:sz w:val="24"/>
-                      <w:lang w:val="en-US"/>
+                      <w:rFonts w:ascii="Calibri" w:hAnsi="Calibri" w:cs="Calibri"/>
+                      <w:bCs/>
+                      <w:sz w:val="18"/>
+                      <w:szCs w:val="18"/>
                     </w:rPr>
-                    <w:t xml:space="preserve"> </w:t>
+                    <w:t>{{SERVICE_ADDRESS}}</w:t>
+                  </w:r>
+                </w:p>
+                <w:p>
+                  <w:pPr>
+                    <w:pStyle w:val="TableParagraph"/>
+                    <w:spacing w:before="38"/>
+                    <w:rPr>
+                      <w:rFonts w:ascii="Calibri" w:hAnsi="Calibri" w:cs="Calibri"/>
+                      <w:bCs/>
+                      <w:sz w:val="18"/>
+                      <w:szCs w:val="18"/>
+                    </w:rPr>
+                  </w:pPr>
+                  <w:r>
+                    <w:rPr>
+                      <w:rFonts w:ascii="Calibri" w:hAnsi="Calibri" w:cs="Calibri"/>
+                      <w:bCs/>
+                      <w:sz w:val="18"/>
+                      <w:szCs w:val="18"/>
+                    </w:rPr>
+                    <w:t>{{SERVICE_TEL}}</w:t>
+                  </w:r>
+                </w:p>
+                <w:p>
+                  <w:pPr>
+                    <w:pStyle w:val="TableParagraph"/>
+                    <w:spacing w:before="38"/>
+                    <w:rPr>
+                      <w:rFonts w:ascii="Calibri" w:hAnsi="Calibri" w:cs="Calibri"/>
+                      <w:bCs/>
+                      <w:sz w:val="18"/>
+                      <w:szCs w:val="18"/>
+                    </w:rPr>
+                  </w:pPr>
+                  <w:r>
+                    <w:rPr>
+                      <w:rFonts w:ascii="Calibri" w:hAnsi="Calibri" w:cs="Calibri"/>
+                      <w:bCs/>
+                      <w:sz w:val="18"/>
+                      <w:szCs w:val="18"/>
+                    </w:rPr>
+                    <w:t>{{SERVICE_MOBILE}}</w:t>
+                  </w:r>
+                </w:p>
+                <w:p>
+                  <w:pPr>
+                    <w:pStyle w:val="TableParagraph"/>
+                    <w:spacing w:before="38"/>
+                    <w:rPr>
+                      <w:rFonts w:ascii="Calibri" w:hAnsi="Calibri" w:cs="Calibri"/>
+                      <w:bCs/>
+                      <w:sz w:val="18"/>
+                      <w:szCs w:val="18"/>
+                    </w:rPr>
+                  </w:pPr>
+                  <w:r>
+                    <w:rPr>
+                      <w:rFonts w:ascii="Calibri" w:hAnsi="Calibri" w:cs="Calibri"/>
+                      <w:bCs/>
+                      <w:sz w:val="18"/>
+                      <w:szCs w:val="18"/>
+                    </w:rPr>
+                    <w:t>{</w:t>
                   </w:r>
                   <w:r>
                     <w:rPr>
-                      <w:rFonts w:hint="default" w:ascii="Calibri" w:hAnsi="Calibri" w:cs="Calibri"/>
-                      <w:b w:val="0"/>
+                      <w:rFonts w:ascii="Calibri" w:hAnsi="Calibri" w:cs="Calibri"/>
                       <w:bCs/>
-                      <w:sz w:val="24"/>
-                      <w:lang w:val="en-US"/>
+                      <w:sz w:val="18"/>
+                      <w:szCs w:val="18"/>
                     </w:rPr>
-                    <w:t>{principal_details}</w:t>
+                    <w:t>{SERVICE_FAX}}</w:t>
+                  </w:r>
+                </w:p>
+                <w:p>
+                  <w:pPr>
+                    <w:pStyle w:val="TableParagraph"/>
+                    <w:rPr>
+                      <w:rFonts w:ascii="Times New Roman"/>
+                    </w:rPr>
+                  </w:pPr>
+                  <w:r>
+                    <w:rPr>
+                      <w:rFonts w:ascii="Calibri" w:hAnsi="Calibri" w:cs="Calibri"/>
+                      <w:bCs/>
+                      <w:sz w:val="18"/>
+                      <w:szCs w:val="18"/>
+                    </w:rPr>
+                    <w:t>{{SERVICE_EMAIL}}</w:t>
                   </w:r>
                 </w:p>
               </w:tc>
@@ -1050,7 +1030,7 @@
           </w:tbl>
           <w:p>
             <w:pPr>
-              <w:pStyle w:val="6"/>
+              <w:pStyle w:val="TableParagraph"/>
               <w:rPr>
                 <w:rFonts w:ascii="Times New Roman"/>
               </w:rPr>
@@ -1058,7 +1038,7 @@
           </w:p>
           <w:p>
             <w:pPr>
-              <w:pStyle w:val="6"/>
+              <w:pStyle w:val="TableParagraph"/>
               <w:spacing w:before="131"/>
               <w:rPr>
                 <w:rFonts w:ascii="Times New Roman"/>
@@ -1067,7 +1047,7 @@
           </w:p>
           <w:p>
             <w:pPr>
-              <w:pStyle w:val="6"/>
+              <w:pStyle w:val="TableParagraph"/>
               <w:spacing w:before="1" w:line="276" w:lineRule="auto"/>
               <w:ind w:left="405" w:right="278"/>
             </w:pPr>
@@ -1084,6 +1064,7 @@
               </w:rPr>
               <w:t xml:space="preserve"> </w:t>
             </w:r>
+            <w:proofErr w:type="gramStart"/>
             <w:r>
               <w:rPr>
                 <w:rFonts w:ascii="Arial"/>
@@ -1094,10 +1075,9 @@
             </w:r>
             <w:r>
               <w:rPr>
-                <w:rFonts w:hint="default" w:ascii="Arial"/>
-                <w:b/>
-                <w:w w:val="80"/>
-                <w:lang w:val="en-US"/>
+                <w:rFonts w:ascii="Arial"/>
+                <w:b/>
+                <w:w w:val="80"/>
               </w:rPr>
               <w:t>{principal}</w:t>
             </w:r>
@@ -1107,7 +1087,16 @@
                 <w:b/>
                 <w:w w:val="80"/>
               </w:rPr>
-              <w:t xml:space="preserve">       </w:t>
+              <w:t xml:space="preserve">   </w:t>
+            </w:r>
+            <w:proofErr w:type="gramEnd"/>
+            <w:r>
+              <w:rPr>
+                <w:rFonts w:ascii="Arial"/>
+                <w:b/>
+                <w:w w:val="80"/>
+              </w:rPr>
+              <w:t xml:space="preserve">    </w:t>
             </w:r>
             <w:r>
               <w:rPr>
@@ -1212,7 +1201,6 @@
             <w:r>
               <w:rPr>
                 <w:strike/>
-                <w:dstrike w:val="0"/>
                 <w:color w:val="444444"/>
                 <w:w w:val="80"/>
               </w:rPr>
@@ -1221,7 +1209,6 @@
             <w:r>
               <w:rPr>
                 <w:strike/>
-                <w:dstrike w:val="0"/>
                 <w:color w:val="444444"/>
                 <w:spacing w:val="-2"/>
               </w:rPr>
@@ -1230,7 +1217,6 @@
             <w:r>
               <w:rPr>
                 <w:strike/>
-                <w:dstrike w:val="0"/>
                 <w:color w:val="444444"/>
                 <w:w w:val="80"/>
               </w:rPr>
@@ -1239,15 +1225,13 @@
             <w:r>
               <w:rPr>
                 <w:strike/>
-                <w:dstrike w:val="0"/>
-                <w:color w:val="444444"/>
-              </w:rPr>
-              <w:t xml:space="preserve"> </w:t>
-            </w:r>
-            <w:r>
-              <w:rPr>
-                <w:strike/>
-                <w:dstrike w:val="0"/>
+                <w:color w:val="444444"/>
+              </w:rPr>
+              <w:t xml:space="preserve"> </w:t>
+            </w:r>
+            <w:r>
+              <w:rPr>
+                <w:strike/>
                 <w:color w:val="444444"/>
                 <w:w w:val="80"/>
               </w:rPr>
@@ -1256,7 +1240,6 @@
             <w:r>
               <w:rPr>
                 <w:strike/>
-                <w:dstrike w:val="0"/>
                 <w:color w:val="444444"/>
                 <w:spacing w:val="40"/>
               </w:rPr>
@@ -1265,7 +1248,6 @@
             <w:r>
               <w:rPr>
                 <w:strike/>
-                <w:dstrike w:val="0"/>
                 <w:color w:val="444444"/>
                 <w:w w:val="80"/>
               </w:rPr>
@@ -1282,24 +1264,8 @@
         </w:tc>
       </w:tr>
       <w:tr>
-        <w:tblPrEx>
-          <w:tblBorders>
-            <w:top w:val="single" w:color="000000" w:sz="4" w:space="0"/>
-            <w:left w:val="single" w:color="000000" w:sz="4" w:space="0"/>
-            <w:bottom w:val="single" w:color="000000" w:sz="4" w:space="0"/>
-            <w:right w:val="single" w:color="000000" w:sz="4" w:space="0"/>
-            <w:insideH w:val="single" w:color="000000" w:sz="4" w:space="0"/>
-            <w:insideV w:val="single" w:color="000000" w:sz="4" w:space="0"/>
-          </w:tblBorders>
-          <w:tblCellMar>
-            <w:top w:w="0" w:type="dxa"/>
-            <w:left w:w="0" w:type="dxa"/>
-            <w:bottom w:w="0" w:type="dxa"/>
-            <w:right w:w="0" w:type="dxa"/>
-          </w:tblCellMar>
-        </w:tblPrEx>
         <w:trPr>
-          <w:trHeight w:val="3669" w:hRule="atLeast"/>
+          <w:trHeight w:val="3669"/>
         </w:trPr>
         <w:tc>
           <w:tcPr>
@@ -1307,7 +1273,7 @@
           </w:tcPr>
           <w:p>
             <w:pPr>
-              <w:pStyle w:val="6"/>
+              <w:pStyle w:val="TableParagraph"/>
               <w:spacing w:before="120"/>
               <w:ind w:left="122"/>
             </w:pPr>
@@ -1327,8 +1293,6 @@
             </w:r>
             <w:r>
               <w:rPr>
-                <w:strike w:val="0"/>
-                <w:dstrike w:val="0"/>
                 <w:color w:val="444444"/>
                 <w:w w:val="80"/>
               </w:rPr>
@@ -1336,8 +1300,6 @@
             </w:r>
             <w:r>
               <w:rPr>
-                <w:strike w:val="0"/>
-                <w:dstrike w:val="0"/>
                 <w:color w:val="444444"/>
                 <w:spacing w:val="-5"/>
               </w:rPr>
@@ -1345,8 +1307,6 @@
             </w:r>
             <w:r>
               <w:rPr>
-                <w:strike w:val="0"/>
-                <w:dstrike w:val="0"/>
                 <w:color w:val="444444"/>
                 <w:w w:val="80"/>
               </w:rPr>
@@ -1354,8 +1314,6 @@
             </w:r>
             <w:r>
               <w:rPr>
-                <w:strike w:val="0"/>
-                <w:dstrike w:val="0"/>
                 <w:color w:val="444444"/>
                 <w:spacing w:val="-7"/>
               </w:rPr>
@@ -1363,8 +1321,6 @@
             </w:r>
             <w:r>
               <w:rPr>
-                <w:strike w:val="0"/>
-                <w:dstrike w:val="0"/>
                 <w:color w:val="444444"/>
                 <w:w w:val="80"/>
               </w:rPr>
@@ -1372,8 +1328,6 @@
             </w:r>
             <w:r>
               <w:rPr>
-                <w:strike w:val="0"/>
-                <w:dstrike w:val="0"/>
                 <w:color w:val="444444"/>
                 <w:spacing w:val="-5"/>
               </w:rPr>
@@ -1381,8 +1335,6 @@
             </w:r>
             <w:r>
               <w:rPr>
-                <w:strike w:val="0"/>
-                <w:dstrike w:val="0"/>
                 <w:color w:val="444444"/>
                 <w:spacing w:val="-2"/>
                 <w:w w:val="80"/>
@@ -1400,7 +1352,7 @@
           </w:p>
           <w:p>
             <w:pPr>
-              <w:pStyle w:val="6"/>
+              <w:pStyle w:val="TableParagraph"/>
               <w:numPr>
                 <w:ilvl w:val="0"/>
                 <w:numId w:val="1"/>
@@ -1412,14 +1364,12 @@
               <w:ind w:left="505" w:hanging="100"/>
               <w:rPr>
                 <w:strike/>
-                <w:dstrike w:val="0"/>
                 <w:color w:val="444444"/>
               </w:rPr>
             </w:pPr>
             <w:r>
               <w:rPr>
                 <w:strike/>
-                <w:dstrike w:val="0"/>
                 <w:color w:val="444444"/>
                 <w:spacing w:val="-7"/>
               </w:rPr>
@@ -1428,7 +1378,6 @@
             <w:r>
               <w:rPr>
                 <w:strike/>
-                <w:dstrike w:val="0"/>
                 <w:color w:val="444444"/>
                 <w:w w:val="80"/>
               </w:rPr>
@@ -1437,7 +1386,6 @@
             <w:r>
               <w:rPr>
                 <w:strike/>
-                <w:dstrike w:val="0"/>
                 <w:color w:val="444444"/>
                 <w:spacing w:val="-6"/>
               </w:rPr>
@@ -1446,7 +1394,6 @@
             <w:r>
               <w:rPr>
                 <w:strike/>
-                <w:dstrike w:val="0"/>
                 <w:color w:val="444444"/>
                 <w:w w:val="80"/>
               </w:rPr>
@@ -1455,7 +1402,6 @@
             <w:r>
               <w:rPr>
                 <w:strike/>
-                <w:dstrike w:val="0"/>
                 <w:color w:val="444444"/>
                 <w:spacing w:val="-6"/>
               </w:rPr>
@@ -1464,7 +1410,6 @@
             <w:r>
               <w:rPr>
                 <w:strike/>
-                <w:dstrike w:val="0"/>
                 <w:color w:val="444444"/>
                 <w:w w:val="80"/>
               </w:rPr>
@@ -1473,7 +1418,6 @@
             <w:r>
               <w:rPr>
                 <w:strike/>
-                <w:dstrike w:val="0"/>
                 <w:color w:val="444444"/>
                 <w:spacing w:val="-8"/>
               </w:rPr>
@@ -1482,7 +1426,6 @@
             <w:r>
               <w:rPr>
                 <w:strike/>
-                <w:dstrike w:val="0"/>
                 <w:color w:val="444444"/>
                 <w:w w:val="80"/>
               </w:rPr>
@@ -1491,7 +1434,6 @@
             <w:r>
               <w:rPr>
                 <w:strike/>
-                <w:dstrike w:val="0"/>
                 <w:color w:val="444444"/>
                 <w:spacing w:val="-6"/>
               </w:rPr>
@@ -1500,7 +1442,6 @@
             <w:r>
               <w:rPr>
                 <w:strike/>
-                <w:dstrike w:val="0"/>
                 <w:color w:val="444444"/>
                 <w:w w:val="80"/>
               </w:rPr>
@@ -1509,7 +1450,6 @@
             <w:r>
               <w:rPr>
                 <w:strike/>
-                <w:dstrike w:val="0"/>
                 <w:color w:val="444444"/>
                 <w:spacing w:val="-8"/>
               </w:rPr>
@@ -1518,7 +1458,6 @@
             <w:r>
               <w:rPr>
                 <w:strike/>
-                <w:dstrike w:val="0"/>
                 <w:color w:val="444444"/>
                 <w:w w:val="80"/>
               </w:rPr>
@@ -1527,7 +1466,6 @@
             <w:r>
               <w:rPr>
                 <w:strike/>
-                <w:dstrike w:val="0"/>
                 <w:color w:val="444444"/>
                 <w:spacing w:val="-8"/>
               </w:rPr>
@@ -1536,7 +1474,6 @@
             <w:r>
               <w:rPr>
                 <w:strike/>
-                <w:dstrike w:val="0"/>
                 <w:color w:val="444444"/>
                 <w:w w:val="80"/>
               </w:rPr>
@@ -1545,7 +1482,6 @@
             <w:r>
               <w:rPr>
                 <w:strike/>
-                <w:dstrike w:val="0"/>
                 <w:color w:val="444444"/>
                 <w:spacing w:val="-7"/>
               </w:rPr>
@@ -1554,7 +1490,6 @@
             <w:r>
               <w:rPr>
                 <w:strike/>
-                <w:dstrike w:val="0"/>
                 <w:color w:val="444444"/>
                 <w:spacing w:val="-2"/>
                 <w:w w:val="80"/>
@@ -1564,7 +1499,7 @@
           </w:p>
           <w:p>
             <w:pPr>
-              <w:pStyle w:val="6"/>
+              <w:pStyle w:val="TableParagraph"/>
               <w:numPr>
                 <w:ilvl w:val="1"/>
                 <w:numId w:val="1"/>
@@ -1575,14 +1510,12 @@
               <w:ind w:right="346" w:firstLine="0"/>
               <w:rPr>
                 <w:strike/>
-                <w:dstrike w:val="0"/>
                 <w:color w:val="444444"/>
               </w:rPr>
             </w:pPr>
             <w:r>
               <w:rPr>
                 <w:strike/>
-                <w:dstrike w:val="0"/>
                 <w:color w:val="444444"/>
                 <w:w w:val="80"/>
               </w:rPr>
@@ -1591,7 +1524,6 @@
             <w:r>
               <w:rPr>
                 <w:strike/>
-                <w:dstrike w:val="0"/>
                 <w:color w:val="444444"/>
                 <w:w w:val="90"/>
               </w:rPr>
@@ -1600,7 +1532,7 @@
           </w:p>
           <w:p>
             <w:pPr>
-              <w:pStyle w:val="6"/>
+              <w:pStyle w:val="TableParagraph"/>
               <w:numPr>
                 <w:ilvl w:val="1"/>
                 <w:numId w:val="1"/>
@@ -1611,14 +1543,12 @@
               <w:ind w:left="1000" w:hanging="170"/>
               <w:rPr>
                 <w:strike/>
-                <w:dstrike w:val="0"/>
                 <w:color w:val="444444"/>
               </w:rPr>
             </w:pPr>
             <w:r>
               <w:rPr>
                 <w:strike/>
-                <w:dstrike w:val="0"/>
                 <w:color w:val="444444"/>
                 <w:spacing w:val="-7"/>
               </w:rPr>
@@ -1627,7 +1557,6 @@
             <w:r>
               <w:rPr>
                 <w:strike/>
-                <w:dstrike w:val="0"/>
                 <w:color w:val="444444"/>
                 <w:w w:val="80"/>
               </w:rPr>
@@ -1636,7 +1565,6 @@
             <w:r>
               <w:rPr>
                 <w:strike/>
-                <w:dstrike w:val="0"/>
                 <w:color w:val="444444"/>
                 <w:spacing w:val="-6"/>
               </w:rPr>
@@ -1645,7 +1573,6 @@
             <w:r>
               <w:rPr>
                 <w:strike/>
-                <w:dstrike w:val="0"/>
                 <w:color w:val="444444"/>
                 <w:w w:val="80"/>
               </w:rPr>
@@ -1654,7 +1581,6 @@
             <w:r>
               <w:rPr>
                 <w:strike/>
-                <w:dstrike w:val="0"/>
                 <w:color w:val="444444"/>
                 <w:spacing w:val="-6"/>
               </w:rPr>
@@ -1663,7 +1589,6 @@
             <w:r>
               <w:rPr>
                 <w:strike/>
-                <w:dstrike w:val="0"/>
                 <w:color w:val="444444"/>
                 <w:w w:val="80"/>
               </w:rPr>
@@ -1672,7 +1597,6 @@
             <w:r>
               <w:rPr>
                 <w:strike/>
-                <w:dstrike w:val="0"/>
                 <w:color w:val="444444"/>
                 <w:spacing w:val="-7"/>
               </w:rPr>
@@ -1681,7 +1605,6 @@
             <w:r>
               <w:rPr>
                 <w:strike/>
-                <w:dstrike w:val="0"/>
                 <w:color w:val="444444"/>
                 <w:w w:val="80"/>
               </w:rPr>
@@ -1690,7 +1613,6 @@
             <w:r>
               <w:rPr>
                 <w:strike/>
-                <w:dstrike w:val="0"/>
                 <w:color w:val="444444"/>
                 <w:spacing w:val="-6"/>
               </w:rPr>
@@ -1699,7 +1621,6 @@
             <w:r>
               <w:rPr>
                 <w:strike/>
-                <w:dstrike w:val="0"/>
                 <w:color w:val="444444"/>
                 <w:w w:val="80"/>
               </w:rPr>
@@ -1708,7 +1629,6 @@
             <w:r>
               <w:rPr>
                 <w:strike/>
-                <w:dstrike w:val="0"/>
                 <w:color w:val="444444"/>
                 <w:spacing w:val="-6"/>
               </w:rPr>
@@ -1717,7 +1637,6 @@
             <w:r>
               <w:rPr>
                 <w:strike/>
-                <w:dstrike w:val="0"/>
                 <w:color w:val="444444"/>
                 <w:w w:val="80"/>
               </w:rPr>
@@ -1726,7 +1645,6 @@
             <w:r>
               <w:rPr>
                 <w:strike/>
-                <w:dstrike w:val="0"/>
                 <w:color w:val="444444"/>
                 <w:spacing w:val="-9"/>
               </w:rPr>
@@ -1735,7 +1653,6 @@
             <w:r>
               <w:rPr>
                 <w:strike/>
-                <w:dstrike w:val="0"/>
                 <w:color w:val="444444"/>
                 <w:w w:val="80"/>
               </w:rPr>
@@ -1744,7 +1661,6 @@
             <w:r>
               <w:rPr>
                 <w:strike/>
-                <w:dstrike w:val="0"/>
                 <w:color w:val="444444"/>
                 <w:spacing w:val="-6"/>
               </w:rPr>
@@ -1753,7 +1669,6 @@
             <w:r>
               <w:rPr>
                 <w:strike/>
-                <w:dstrike w:val="0"/>
                 <w:color w:val="444444"/>
                 <w:w w:val="80"/>
               </w:rPr>
@@ -1762,7 +1677,6 @@
             <w:r>
               <w:rPr>
                 <w:strike/>
-                <w:dstrike w:val="0"/>
                 <w:color w:val="444444"/>
                 <w:spacing w:val="-7"/>
               </w:rPr>
@@ -1771,7 +1685,6 @@
             <w:r>
               <w:rPr>
                 <w:strike/>
-                <w:dstrike w:val="0"/>
                 <w:color w:val="444444"/>
                 <w:spacing w:val="-2"/>
                 <w:w w:val="80"/>
@@ -1781,7 +1694,7 @@
           </w:p>
           <w:p>
             <w:pPr>
-              <w:pStyle w:val="6"/>
+              <w:pStyle w:val="TableParagraph"/>
               <w:numPr>
                 <w:ilvl w:val="0"/>
                 <w:numId w:val="1"/>
@@ -1793,14 +1706,12 @@
               <w:ind w:hanging="151"/>
               <w:rPr>
                 <w:strike/>
-                <w:dstrike w:val="0"/>
                 <w:color w:val="444444"/>
               </w:rPr>
             </w:pPr>
             <w:r>
               <w:rPr>
                 <w:strike/>
-                <w:dstrike w:val="0"/>
                 <w:color w:val="444444"/>
                 <w:spacing w:val="-5"/>
               </w:rPr>
@@ -1809,7 +1720,6 @@
             <w:r>
               <w:rPr>
                 <w:strike/>
-                <w:dstrike w:val="0"/>
                 <w:color w:val="444444"/>
                 <w:w w:val="80"/>
               </w:rPr>
@@ -1818,7 +1728,6 @@
             <w:r>
               <w:rPr>
                 <w:strike/>
-                <w:dstrike w:val="0"/>
                 <w:color w:val="444444"/>
                 <w:spacing w:val="-5"/>
               </w:rPr>
@@ -1827,7 +1736,6 @@
             <w:r>
               <w:rPr>
                 <w:strike/>
-                <w:dstrike w:val="0"/>
                 <w:color w:val="444444"/>
                 <w:w w:val="80"/>
               </w:rPr>
@@ -1836,7 +1744,6 @@
             <w:r>
               <w:rPr>
                 <w:strike/>
-                <w:dstrike w:val="0"/>
                 <w:color w:val="444444"/>
                 <w:spacing w:val="-5"/>
               </w:rPr>
@@ -1845,7 +1752,6 @@
             <w:r>
               <w:rPr>
                 <w:strike/>
-                <w:dstrike w:val="0"/>
                 <w:color w:val="444444"/>
                 <w:w w:val="80"/>
               </w:rPr>
@@ -1854,7 +1760,6 @@
             <w:r>
               <w:rPr>
                 <w:strike/>
-                <w:dstrike w:val="0"/>
                 <w:color w:val="444444"/>
                 <w:spacing w:val="-5"/>
               </w:rPr>
@@ -1863,7 +1768,6 @@
             <w:r>
               <w:rPr>
                 <w:strike/>
-                <w:dstrike w:val="0"/>
                 <w:color w:val="444444"/>
                 <w:w w:val="80"/>
               </w:rPr>
@@ -1872,7 +1776,6 @@
             <w:r>
               <w:rPr>
                 <w:strike/>
-                <w:dstrike w:val="0"/>
                 <w:color w:val="444444"/>
                 <w:spacing w:val="-5"/>
               </w:rPr>
@@ -1881,7 +1784,6 @@
             <w:r>
               <w:rPr>
                 <w:strike/>
-                <w:dstrike w:val="0"/>
                 <w:color w:val="444444"/>
                 <w:w w:val="80"/>
               </w:rPr>
@@ -1890,7 +1792,6 @@
             <w:r>
               <w:rPr>
                 <w:strike/>
-                <w:dstrike w:val="0"/>
                 <w:color w:val="444444"/>
                 <w:spacing w:val="-8"/>
               </w:rPr>
@@ -1899,7 +1800,6 @@
             <w:r>
               <w:rPr>
                 <w:strike/>
-                <w:dstrike w:val="0"/>
                 <w:color w:val="444444"/>
                 <w:w w:val="80"/>
               </w:rPr>
@@ -1908,7 +1808,6 @@
             <w:r>
               <w:rPr>
                 <w:strike/>
-                <w:dstrike w:val="0"/>
                 <w:color w:val="444444"/>
                 <w:spacing w:val="-7"/>
               </w:rPr>
@@ -1917,7 +1816,6 @@
             <w:r>
               <w:rPr>
                 <w:strike/>
-                <w:dstrike w:val="0"/>
                 <w:color w:val="444444"/>
                 <w:w w:val="80"/>
               </w:rPr>
@@ -1926,7 +1824,6 @@
             <w:r>
               <w:rPr>
                 <w:strike/>
-                <w:dstrike w:val="0"/>
                 <w:color w:val="444444"/>
                 <w:spacing w:val="-5"/>
                 <w:w w:val="80"/>
@@ -1936,7 +1833,7 @@
           </w:p>
           <w:p>
             <w:pPr>
-              <w:pStyle w:val="6"/>
+              <w:pStyle w:val="TableParagraph"/>
               <w:numPr>
                 <w:ilvl w:val="1"/>
                 <w:numId w:val="1"/>
@@ -1948,14 +1845,12 @@
               <w:ind w:left="1000" w:hanging="170"/>
               <w:rPr>
                 <w:strike/>
-                <w:dstrike w:val="0"/>
                 <w:color w:val="444444"/>
               </w:rPr>
             </w:pPr>
             <w:r>
               <w:rPr>
                 <w:strike/>
-                <w:dstrike w:val="0"/>
                 <w:color w:val="444444"/>
                 <w:spacing w:val="-6"/>
               </w:rPr>
@@ -1964,7 +1859,6 @@
             <w:r>
               <w:rPr>
                 <w:strike/>
-                <w:dstrike w:val="0"/>
                 <w:color w:val="444444"/>
                 <w:w w:val="80"/>
               </w:rPr>
@@ -1973,7 +1867,6 @@
             <w:r>
               <w:rPr>
                 <w:strike/>
-                <w:dstrike w:val="0"/>
                 <w:color w:val="444444"/>
                 <w:spacing w:val="-5"/>
               </w:rPr>
@@ -1982,7 +1875,6 @@
             <w:r>
               <w:rPr>
                 <w:strike/>
-                <w:dstrike w:val="0"/>
                 <w:color w:val="444444"/>
                 <w:w w:val="80"/>
               </w:rPr>
@@ -1991,7 +1883,6 @@
             <w:r>
               <w:rPr>
                 <w:strike/>
-                <w:dstrike w:val="0"/>
                 <w:color w:val="444444"/>
                 <w:spacing w:val="-5"/>
               </w:rPr>
@@ -2000,7 +1891,6 @@
             <w:r>
               <w:rPr>
                 <w:strike/>
-                <w:dstrike w:val="0"/>
                 <w:color w:val="444444"/>
                 <w:w w:val="80"/>
               </w:rPr>
@@ -2009,7 +1899,6 @@
             <w:r>
               <w:rPr>
                 <w:strike/>
-                <w:dstrike w:val="0"/>
                 <w:color w:val="444444"/>
                 <w:spacing w:val="-5"/>
               </w:rPr>
@@ -2018,7 +1907,6 @@
             <w:r>
               <w:rPr>
                 <w:strike/>
-                <w:dstrike w:val="0"/>
                 <w:color w:val="444444"/>
                 <w:w w:val="80"/>
               </w:rPr>
@@ -2027,7 +1915,6 @@
             <w:r>
               <w:rPr>
                 <w:strike/>
-                <w:dstrike w:val="0"/>
                 <w:color w:val="444444"/>
                 <w:spacing w:val="-5"/>
               </w:rPr>
@@ -2036,7 +1923,6 @@
             <w:r>
               <w:rPr>
                 <w:strike/>
-                <w:dstrike w:val="0"/>
                 <w:color w:val="444444"/>
                 <w:w w:val="80"/>
               </w:rPr>
@@ -2045,7 +1931,6 @@
             <w:r>
               <w:rPr>
                 <w:strike/>
-                <w:dstrike w:val="0"/>
                 <w:color w:val="444444"/>
                 <w:spacing w:val="-5"/>
               </w:rPr>
@@ -2054,7 +1939,6 @@
             <w:r>
               <w:rPr>
                 <w:strike/>
-                <w:dstrike w:val="0"/>
                 <w:color w:val="444444"/>
                 <w:w w:val="80"/>
               </w:rPr>
@@ -2063,7 +1947,6 @@
             <w:r>
               <w:rPr>
                 <w:strike/>
-                <w:dstrike w:val="0"/>
                 <w:color w:val="444444"/>
                 <w:spacing w:val="-7"/>
               </w:rPr>
@@ -2072,7 +1955,6 @@
             <w:r>
               <w:rPr>
                 <w:strike/>
-                <w:dstrike w:val="0"/>
                 <w:color w:val="444444"/>
                 <w:w w:val="80"/>
               </w:rPr>
@@ -2081,7 +1963,6 @@
             <w:r>
               <w:rPr>
                 <w:strike/>
-                <w:dstrike w:val="0"/>
                 <w:color w:val="444444"/>
                 <w:spacing w:val="-5"/>
               </w:rPr>
@@ -2090,7 +1971,6 @@
             <w:r>
               <w:rPr>
                 <w:strike/>
-                <w:dstrike w:val="0"/>
                 <w:color w:val="444444"/>
                 <w:w w:val="80"/>
               </w:rPr>
@@ -2099,7 +1979,6 @@
             <w:r>
               <w:rPr>
                 <w:strike/>
-                <w:dstrike w:val="0"/>
                 <w:color w:val="444444"/>
                 <w:spacing w:val="-5"/>
               </w:rPr>
@@ -2108,7 +1987,6 @@
             <w:r>
               <w:rPr>
                 <w:strike/>
-                <w:dstrike w:val="0"/>
                 <w:color w:val="444444"/>
                 <w:w w:val="80"/>
               </w:rPr>
@@ -2117,7 +1995,6 @@
             <w:r>
               <w:rPr>
                 <w:strike/>
-                <w:dstrike w:val="0"/>
                 <w:color w:val="444444"/>
                 <w:spacing w:val="-5"/>
               </w:rPr>
@@ -2126,7 +2003,6 @@
             <w:r>
               <w:rPr>
                 <w:strike/>
-                <w:dstrike w:val="0"/>
                 <w:color w:val="444444"/>
                 <w:w w:val="80"/>
               </w:rPr>
@@ -2135,7 +2011,6 @@
             <w:r>
               <w:rPr>
                 <w:strike/>
-                <w:dstrike w:val="0"/>
                 <w:color w:val="444444"/>
                 <w:spacing w:val="-5"/>
               </w:rPr>
@@ -2144,7 +2019,6 @@
             <w:r>
               <w:rPr>
                 <w:strike/>
-                <w:dstrike w:val="0"/>
                 <w:color w:val="444444"/>
                 <w:w w:val="80"/>
               </w:rPr>
@@ -2153,7 +2027,6 @@
             <w:r>
               <w:rPr>
                 <w:strike/>
-                <w:dstrike w:val="0"/>
                 <w:color w:val="444444"/>
                 <w:spacing w:val="-5"/>
               </w:rPr>
@@ -2162,7 +2035,6 @@
             <w:r>
               <w:rPr>
                 <w:strike/>
-                <w:dstrike w:val="0"/>
                 <w:color w:val="444444"/>
                 <w:w w:val="80"/>
               </w:rPr>
@@ -2171,7 +2043,6 @@
             <w:r>
               <w:rPr>
                 <w:strike/>
-                <w:dstrike w:val="0"/>
                 <w:color w:val="444444"/>
                 <w:spacing w:val="-8"/>
               </w:rPr>
@@ -2180,7 +2051,6 @@
             <w:r>
               <w:rPr>
                 <w:strike/>
-                <w:dstrike w:val="0"/>
                 <w:color w:val="444444"/>
                 <w:w w:val="80"/>
               </w:rPr>
@@ -2189,7 +2059,6 @@
             <w:r>
               <w:rPr>
                 <w:strike/>
-                <w:dstrike w:val="0"/>
                 <w:color w:val="444444"/>
                 <w:spacing w:val="-5"/>
               </w:rPr>
@@ -2198,7 +2067,6 @@
             <w:r>
               <w:rPr>
                 <w:strike/>
-                <w:dstrike w:val="0"/>
                 <w:color w:val="444444"/>
                 <w:w w:val="80"/>
               </w:rPr>
@@ -2207,7 +2075,6 @@
             <w:r>
               <w:rPr>
                 <w:strike/>
-                <w:dstrike w:val="0"/>
                 <w:color w:val="444444"/>
                 <w:spacing w:val="-5"/>
               </w:rPr>
@@ -2216,7 +2083,6 @@
             <w:r>
               <w:rPr>
                 <w:strike/>
-                <w:dstrike w:val="0"/>
                 <w:color w:val="444444"/>
                 <w:spacing w:val="-2"/>
                 <w:w w:val="80"/>
@@ -2226,7 +2092,7 @@
           </w:p>
           <w:p>
             <w:pPr>
-              <w:pStyle w:val="6"/>
+              <w:pStyle w:val="TableParagraph"/>
               <w:numPr>
                 <w:ilvl w:val="1"/>
                 <w:numId w:val="1"/>
@@ -2238,14 +2104,12 @@
               <w:ind w:left="1000" w:hanging="170"/>
               <w:rPr>
                 <w:strike/>
-                <w:dstrike w:val="0"/>
                 <w:color w:val="444444"/>
               </w:rPr>
             </w:pPr>
             <w:r>
               <w:rPr>
                 <w:strike/>
-                <w:dstrike w:val="0"/>
                 <w:color w:val="444444"/>
                 <w:spacing w:val="-7"/>
               </w:rPr>
@@ -2254,7 +2118,6 @@
             <w:r>
               <w:rPr>
                 <w:strike/>
-                <w:dstrike w:val="0"/>
                 <w:color w:val="444444"/>
                 <w:w w:val="80"/>
               </w:rPr>
@@ -2263,7 +2126,6 @@
             <w:r>
               <w:rPr>
                 <w:strike/>
-                <w:dstrike w:val="0"/>
                 <w:color w:val="444444"/>
                 <w:spacing w:val="-6"/>
               </w:rPr>
@@ -2272,7 +2134,6 @@
             <w:r>
               <w:rPr>
                 <w:strike/>
-                <w:dstrike w:val="0"/>
                 <w:color w:val="444444"/>
                 <w:w w:val="80"/>
               </w:rPr>
@@ -2281,7 +2142,6 @@
             <w:r>
               <w:rPr>
                 <w:strike/>
-                <w:dstrike w:val="0"/>
                 <w:color w:val="444444"/>
                 <w:spacing w:val="-6"/>
               </w:rPr>
@@ -2290,7 +2150,6 @@
             <w:r>
               <w:rPr>
                 <w:strike/>
-                <w:dstrike w:val="0"/>
                 <w:color w:val="444444"/>
                 <w:w w:val="80"/>
               </w:rPr>
@@ -2299,7 +2158,6 @@
             <w:r>
               <w:rPr>
                 <w:strike/>
-                <w:dstrike w:val="0"/>
                 <w:color w:val="444444"/>
                 <w:spacing w:val="-7"/>
               </w:rPr>
@@ -2308,7 +2166,6 @@
             <w:r>
               <w:rPr>
                 <w:strike/>
-                <w:dstrike w:val="0"/>
                 <w:color w:val="444444"/>
                 <w:w w:val="80"/>
               </w:rPr>
@@ -2317,7 +2174,6 @@
             <w:r>
               <w:rPr>
                 <w:strike/>
-                <w:dstrike w:val="0"/>
                 <w:color w:val="444444"/>
                 <w:spacing w:val="-6"/>
               </w:rPr>
@@ -2326,7 +2182,6 @@
             <w:r>
               <w:rPr>
                 <w:strike/>
-                <w:dstrike w:val="0"/>
                 <w:color w:val="444444"/>
                 <w:w w:val="80"/>
               </w:rPr>
@@ -2335,7 +2190,6 @@
             <w:r>
               <w:rPr>
                 <w:strike/>
-                <w:dstrike w:val="0"/>
                 <w:color w:val="444444"/>
                 <w:spacing w:val="-6"/>
               </w:rPr>
@@ -2344,7 +2198,6 @@
             <w:r>
               <w:rPr>
                 <w:strike/>
-                <w:dstrike w:val="0"/>
                 <w:color w:val="444444"/>
                 <w:w w:val="80"/>
               </w:rPr>
@@ -2353,7 +2206,6 @@
             <w:r>
               <w:rPr>
                 <w:strike/>
-                <w:dstrike w:val="0"/>
                 <w:color w:val="444444"/>
                 <w:spacing w:val="-9"/>
               </w:rPr>
@@ -2362,7 +2214,6 @@
             <w:r>
               <w:rPr>
                 <w:strike/>
-                <w:dstrike w:val="0"/>
                 <w:color w:val="444444"/>
                 <w:w w:val="80"/>
               </w:rPr>
@@ -2371,7 +2222,6 @@
             <w:r>
               <w:rPr>
                 <w:strike/>
-                <w:dstrike w:val="0"/>
                 <w:color w:val="444444"/>
                 <w:spacing w:val="-6"/>
               </w:rPr>
@@ -2380,7 +2230,6 @@
             <w:r>
               <w:rPr>
                 <w:strike/>
-                <w:dstrike w:val="0"/>
                 <w:color w:val="444444"/>
                 <w:w w:val="80"/>
               </w:rPr>
@@ -2389,7 +2238,6 @@
             <w:r>
               <w:rPr>
                 <w:strike/>
-                <w:dstrike w:val="0"/>
                 <w:color w:val="444444"/>
                 <w:spacing w:val="-7"/>
               </w:rPr>
@@ -2398,7 +2246,6 @@
             <w:r>
               <w:rPr>
                 <w:strike/>
-                <w:dstrike w:val="0"/>
                 <w:color w:val="444444"/>
                 <w:spacing w:val="-2"/>
                 <w:w w:val="80"/>
@@ -2408,7 +2255,7 @@
           </w:p>
           <w:p>
             <w:pPr>
-              <w:pStyle w:val="6"/>
+              <w:pStyle w:val="TableParagraph"/>
               <w:numPr>
                 <w:ilvl w:val="0"/>
                 <w:numId w:val="1"/>
@@ -2531,7 +2378,7 @@
           </w:p>
           <w:p>
             <w:pPr>
-              <w:pStyle w:val="6"/>
+              <w:pStyle w:val="TableParagraph"/>
               <w:numPr>
                 <w:ilvl w:val="1"/>
                 <w:numId w:val="1"/>
@@ -2565,12 +2412,30 @@
                 <w:spacing w:val="-2"/>
                 <w:w w:val="85"/>
               </w:rPr>
-              <w:t>of India, Approval Attached and Anna University, Govt of Tamilnadu Letter Attached.</w:t>
+              <w:t xml:space="preserve">of India, Approval Attached and Anna University, Govt of </w:t>
+            </w:r>
+            <w:proofErr w:type="spellStart"/>
+            <w:r>
+              <w:rPr>
+                <w:color w:val="444444"/>
+                <w:spacing w:val="-2"/>
+                <w:w w:val="85"/>
+              </w:rPr>
+              <w:t>Tamilnadu</w:t>
+            </w:r>
+            <w:proofErr w:type="spellEnd"/>
+            <w:r>
+              <w:rPr>
+                <w:color w:val="444444"/>
+                <w:spacing w:val="-2"/>
+                <w:w w:val="85"/>
+              </w:rPr>
+              <w:t xml:space="preserve"> Letter Attached.</w:t>
             </w:r>
           </w:p>
           <w:p>
             <w:pPr>
-              <w:pStyle w:val="6"/>
+              <w:pStyle w:val="TableParagraph"/>
               <w:numPr>
                 <w:ilvl w:val="1"/>
                 <w:numId w:val="1"/>
@@ -2582,7 +2447,6 @@
               <w:ind w:left="1000" w:hanging="170"/>
               <w:rPr>
                 <w:strike/>
-                <w:dstrike w:val="0"/>
                 <w:color w:val="444444"/>
                 <w:spacing w:val="-2"/>
                 <w:w w:val="80"/>
@@ -2591,7 +2455,6 @@
             <w:r>
               <w:rPr>
                 <w:strike/>
-                <w:dstrike w:val="0"/>
                 <w:color w:val="444444"/>
                 <w:spacing w:val="-6"/>
               </w:rPr>
@@ -2600,7 +2463,6 @@
             <w:r>
               <w:rPr>
                 <w:strike/>
-                <w:dstrike w:val="0"/>
                 <w:color w:val="444444"/>
                 <w:w w:val="80"/>
               </w:rPr>
@@ -2609,7 +2471,6 @@
             <w:r>
               <w:rPr>
                 <w:strike/>
-                <w:dstrike w:val="0"/>
                 <w:color w:val="444444"/>
                 <w:spacing w:val="-5"/>
               </w:rPr>
@@ -2618,7 +2479,6 @@
             <w:r>
               <w:rPr>
                 <w:strike/>
-                <w:dstrike w:val="0"/>
                 <w:color w:val="444444"/>
                 <w:w w:val="80"/>
               </w:rPr>
@@ -2627,7 +2487,6 @@
             <w:r>
               <w:rPr>
                 <w:strike/>
-                <w:dstrike w:val="0"/>
                 <w:color w:val="444444"/>
                 <w:spacing w:val="-6"/>
               </w:rPr>
@@ -2636,7 +2495,6 @@
             <w:r>
               <w:rPr>
                 <w:strike/>
-                <w:dstrike w:val="0"/>
                 <w:color w:val="444444"/>
                 <w:w w:val="80"/>
               </w:rPr>
@@ -2645,7 +2503,6 @@
             <w:r>
               <w:rPr>
                 <w:strike/>
-                <w:dstrike w:val="0"/>
                 <w:color w:val="444444"/>
                 <w:spacing w:val="-5"/>
               </w:rPr>
@@ -2654,7 +2511,6 @@
             <w:r>
               <w:rPr>
                 <w:strike/>
-                <w:dstrike w:val="0"/>
                 <w:color w:val="444444"/>
                 <w:w w:val="80"/>
               </w:rPr>
@@ -2663,7 +2519,6 @@
             <w:r>
               <w:rPr>
                 <w:strike/>
-                <w:dstrike w:val="0"/>
                 <w:color w:val="444444"/>
                 <w:spacing w:val="-6"/>
               </w:rPr>
@@ -2672,7 +2527,6 @@
             <w:r>
               <w:rPr>
                 <w:strike/>
-                <w:dstrike w:val="0"/>
                 <w:color w:val="444444"/>
                 <w:w w:val="80"/>
               </w:rPr>
@@ -2681,7 +2535,6 @@
             <w:r>
               <w:rPr>
                 <w:strike/>
-                <w:dstrike w:val="0"/>
                 <w:color w:val="444444"/>
                 <w:spacing w:val="-5"/>
               </w:rPr>
@@ -2690,7 +2543,6 @@
             <w:r>
               <w:rPr>
                 <w:strike/>
-                <w:dstrike w:val="0"/>
                 <w:color w:val="444444"/>
                 <w:w w:val="80"/>
               </w:rPr>
@@ -2699,7 +2551,6 @@
             <w:r>
               <w:rPr>
                 <w:strike/>
-                <w:dstrike w:val="0"/>
                 <w:color w:val="444444"/>
                 <w:spacing w:val="-6"/>
               </w:rPr>
@@ -2708,7 +2559,6 @@
             <w:r>
               <w:rPr>
                 <w:strike/>
-                <w:dstrike w:val="0"/>
                 <w:color w:val="444444"/>
                 <w:w w:val="80"/>
               </w:rPr>
@@ -2717,7 +2567,6 @@
             <w:r>
               <w:rPr>
                 <w:strike/>
-                <w:dstrike w:val="0"/>
                 <w:color w:val="444444"/>
                 <w:spacing w:val="-7"/>
               </w:rPr>
@@ -2726,7 +2575,6 @@
             <w:r>
               <w:rPr>
                 <w:strike/>
-                <w:dstrike w:val="0"/>
                 <w:color w:val="444444"/>
                 <w:w w:val="80"/>
               </w:rPr>
@@ -2735,7 +2583,6 @@
             <w:r>
               <w:rPr>
                 <w:strike/>
-                <w:dstrike w:val="0"/>
                 <w:color w:val="444444"/>
                 <w:spacing w:val="-6"/>
               </w:rPr>
@@ -2744,7 +2591,6 @@
             <w:r>
               <w:rPr>
                 <w:strike/>
-                <w:dstrike w:val="0"/>
                 <w:color w:val="444444"/>
                 <w:w w:val="80"/>
               </w:rPr>
@@ -2753,7 +2599,6 @@
             <w:r>
               <w:rPr>
                 <w:strike/>
-                <w:dstrike w:val="0"/>
                 <w:color w:val="444444"/>
                 <w:spacing w:val="-5"/>
               </w:rPr>
@@ -2762,7 +2607,6 @@
             <w:r>
               <w:rPr>
                 <w:strike/>
-                <w:dstrike w:val="0"/>
                 <w:color w:val="444444"/>
                 <w:spacing w:val="-2"/>
                 <w:w w:val="80"/>
@@ -2772,9 +2616,9 @@
           </w:p>
           <w:p>
             <w:pPr>
-              <w:pStyle w:val="6"/>
+              <w:pStyle w:val="TableParagraph"/>
               <w:spacing w:before="120" w:line="276" w:lineRule="auto"/>
-              <w:ind w:right="3449" w:firstLine="183" w:firstLineChars="100"/>
+              <w:ind w:right="3449" w:firstLineChars="100" w:firstLine="184"/>
             </w:pPr>
             <w:r>
               <w:rPr>
@@ -2794,48 +2638,44 @@
           </w:p>
           <w:p>
             <w:pPr>
-              <w:pStyle w:val="6"/>
+              <w:pStyle w:val="TableParagraph"/>
               <w:spacing w:before="141"/>
               <w:ind w:left="977"/>
               <w:rPr>
-                <w:rFonts w:hint="default" w:ascii="Arial"/>
-                <w:b/>
-                <w:w w:val="80"/>
-                <w:lang w:val="en-US"/>
+                <w:rFonts w:ascii="Arial"/>
+                <w:b/>
+                <w:w w:val="80"/>
               </w:rPr>
             </w:pPr>
             <w:r>
               <w:rPr>
-                <w:rFonts w:hint="default" w:ascii="Arial"/>
-                <w:b/>
-                <w:w w:val="80"/>
-                <w:lang w:val="en-US"/>
+                <w:rFonts w:ascii="Arial"/>
+                <w:b/>
+                <w:w w:val="80"/>
               </w:rPr>
               <w:t>{principal}</w:t>
             </w:r>
           </w:p>
           <w:p>
             <w:pPr>
-              <w:pStyle w:val="6"/>
+              <w:pStyle w:val="TableParagraph"/>
               <w:spacing w:before="141"/>
               <w:rPr>
-                <w:rFonts w:hint="default" w:ascii="Arial"/>
-                <w:b/>
-                <w:lang w:val="en-US"/>
+                <w:rFonts w:ascii="Arial"/>
+                <w:b/>
               </w:rPr>
             </w:pPr>
             <w:r>
               <w:rPr>
-                <w:rFonts w:hint="default" w:ascii="Arial"/>
-                <w:b/>
-                <w:lang w:val="en-US"/>
+                <w:rFonts w:ascii="Arial"/>
+                <w:b/>
               </w:rPr>
               <w:t xml:space="preserve">                {date}</w:t>
             </w:r>
           </w:p>
           <w:p>
             <w:pPr>
-              <w:pStyle w:val="6"/>
+              <w:pStyle w:val="TableParagraph"/>
               <w:rPr>
                 <w:rFonts w:ascii="Times New Roman"/>
               </w:rPr>
@@ -2843,64 +2683,74 @@
           </w:p>
           <w:p>
             <w:pPr>
-              <w:pStyle w:val="6"/>
+              <w:pStyle w:val="TableParagraph"/>
               <w:spacing w:before="59"/>
               <w:rPr>
-                <w:rFonts w:hint="default" w:ascii="Arial"/>
-                <w:b/>
-                <w:lang w:val="en-US"/>
+                <w:rFonts w:ascii="Arial"/>
+                <w:b/>
               </w:rPr>
             </w:pPr>
             <w:r>
               <w:rPr>
-                <w:rFonts w:hint="default" w:ascii="Arial"/>
-                <w:b/>
-                <w:lang w:val="en-US"/>
+                <w:rFonts w:ascii="Arial"/>
+                <w:b/>
               </w:rPr>
               <w:t xml:space="preserve">                {principal}</w:t>
             </w:r>
           </w:p>
           <w:p>
             <w:pPr>
-              <w:pStyle w:val="6"/>
+              <w:pStyle w:val="TableParagraph"/>
               <w:spacing w:before="59"/>
               <w:rPr>
-                <w:rFonts w:hint="default" w:ascii="Arial"/>
-                <w:b/>
-                <w:lang w:val="en-US"/>
+                <w:rFonts w:ascii="Arial"/>
+                <w:b/>
               </w:rPr>
             </w:pPr>
             <w:r>
               <w:rPr>
-                <w:rFonts w:hint="default" w:ascii="Arial"/>
-                <w:b/>
-                <w:lang w:val="en-US"/>
+                <w:rFonts w:ascii="Arial"/>
+                <w:b/>
               </w:rPr>
               <w:t xml:space="preserve">                {role}</w:t>
             </w:r>
           </w:p>
           <w:p>
             <w:pPr>
-              <w:pStyle w:val="6"/>
+              <w:pStyle w:val="TableParagraph"/>
               <w:spacing w:before="59"/>
               <w:rPr>
-                <w:rFonts w:hint="default" w:ascii="Arial"/>
-                <w:b/>
-                <w:lang w:val="en-US"/>
+                <w:rFonts w:ascii="Arial"/>
+                <w:b/>
               </w:rPr>
             </w:pPr>
             <w:r>
               <w:rPr>
-                <w:rFonts w:hint="default" w:ascii="Arial"/>
-                <w:b/>
-                <w:lang w:val="en-US"/>
-              </w:rPr>
-              <w:t xml:space="preserve">                {clg_name}</w:t>
+                <w:rFonts w:ascii="Arial"/>
+                <w:b/>
+              </w:rPr>
+              <w:t xml:space="preserve">                {</w:t>
+            </w:r>
+            <w:proofErr w:type="spellStart"/>
+            <w:r>
+              <w:rPr>
+                <w:rFonts w:ascii="Arial"/>
+                <w:b/>
+              </w:rPr>
+              <w:t>clg_name</w:t>
+            </w:r>
+            <w:proofErr w:type="spellEnd"/>
+            <w:r>
+              <w:rPr>
+                <w:rFonts w:ascii="Arial"/>
+                <w:b/>
+              </w:rPr>
+              <w:t>}</w:t>
             </w:r>
           </w:p>
           <w:p>
             <w:pPr>
-              <w:pStyle w:val="6"/>
+              <w:pStyle w:val="TableParagraph"/>
               <w:spacing w:before="56"/>
               <w:ind w:left="977"/>
               <w:rPr>
@@ -2911,7 +2761,7 @@
           </w:p>
           <w:p>
             <w:pPr>
-              <w:pStyle w:val="6"/>
+              <w:pStyle w:val="TableParagraph"/>
               <w:spacing w:before="56"/>
               <w:ind w:left="5418"/>
               <w:rPr>
@@ -3131,7 +2981,7 @@
           </w:p>
           <w:p>
             <w:pPr>
-              <w:pStyle w:val="6"/>
+              <w:pStyle w:val="TableParagraph"/>
               <w:rPr>
                 <w:rFonts w:ascii="Times New Roman"/>
                 <w:sz w:val="20"/>
@@ -3140,8 +2990,8 @@
           </w:p>
           <w:p>
             <w:pPr>
-              <w:pStyle w:val="6"/>
-              <w:ind w:firstLine="1034" w:firstLineChars="550"/>
+              <w:pStyle w:val="TableParagraph"/>
+              <w:ind w:firstLineChars="550" w:firstLine="1060"/>
             </w:pPr>
             <w:r>
               <w:rPr>
@@ -3153,9 +3003,9 @@
           </w:p>
           <w:p>
             <w:pPr>
-              <w:pStyle w:val="6"/>
+              <w:pStyle w:val="TableParagraph"/>
               <w:spacing w:before="38"/>
-              <w:ind w:left="977" w:firstLine="88" w:firstLineChars="50"/>
+              <w:ind w:left="977" w:firstLineChars="50" w:firstLine="88"/>
             </w:pPr>
             <w:r>
               <w:rPr>
@@ -3203,25 +3053,16 @@
           </w:p>
           <w:p>
             <w:pPr>
-              <w:pStyle w:val="6"/>
-              <w:widowControl w:val="0"/>
-              <w:numPr>
-                <w:ilvl w:val="0"/>
-                <w:numId w:val="0"/>
-              </w:numPr>
+              <w:pStyle w:val="TableParagraph"/>
               <w:tabs>
                 <w:tab w:val="left" w:pos="1000"/>
               </w:tabs>
-              <w:autoSpaceDE w:val="0"/>
-              <w:autoSpaceDN w:val="0"/>
               <w:spacing w:before="39"/>
-              <w:ind w:firstLine="1057" w:firstLineChars="600"/>
-              <w:rPr>
-                <w:rFonts w:hint="default"/>
+              <w:ind w:firstLineChars="600" w:firstLine="1057"/>
+              <w:rPr>
                 <w:color w:val="444444"/>
                 <w:spacing w:val="-2"/>
                 <w:w w:val="80"/>
-                <w:lang w:val="en-US"/>
               </w:rPr>
             </w:pPr>
             <w:r>
@@ -3266,10 +3107,9 @@
             </w:r>
             <w:r>
               <w:rPr>
-                <w:rFonts w:hint="default" w:ascii="Arial"/>
-                <w:b/>
-                <w:w w:val="80"/>
-                <w:lang w:val="en-US"/>
+                <w:rFonts w:ascii="Arial"/>
+                <w:b/>
+                <w:w w:val="80"/>
               </w:rPr>
               <w:t xml:space="preserve"> Chennai</w:t>
             </w:r>
@@ -3282,19 +3122,19 @@
       <w:type w:val="continuous"/>
       <w:pgSz w:w="11910" w:h="16840"/>
       <w:pgMar w:top="1224" w:right="562" w:bottom="274" w:left="562" w:header="720" w:footer="720" w:gutter="0"/>
-      <w:cols w:space="720" w:num="1"/>
+      <w:cols w:space="720"/>
     </w:sectPr>
   </w:body>
 </w:document>
 </file>
 
 <file path=word/numbering.xml><?xml version="1.0" encoding="utf-8"?>
-<w:numbering xmlns:wpc="http://schemas.microsoft.com/office/word/2010/wordprocessingCanvas" xmlns:mc="http://schemas.openxmlformats.org/markup-compatibility/2006" xmlns:o="urn:schemas-microsoft-com:office:office" xmlns:r="http://schemas.openxmlformats.org/officeDocument/2006/relationships" xmlns:m="http://schemas.openxmlformats.org/officeDocument/2006/math" xmlns:v="urn:schemas-microsoft-com:vml" xmlns:wp14="http://schemas.microsoft.com/office/word/2010/wordprocessingDrawing" xmlns:wp="http://schemas.openxmlformats.org/drawingml/2006/wordprocessingDrawing" xmlns:w10="urn:schemas-microsoft-com:office:word" xmlns:w="http://schemas.openxmlformats.org/wordprocessingml/2006/main" xmlns:w14="http://schemas.microsoft.com/office/word/2010/wordml" xmlns:wpg="http://schemas.microsoft.com/office/word/2010/wordprocessingGroup" xmlns:wpi="http://schemas.microsoft.com/office/word/2010/wordprocessingInk" xmlns:wne="http://schemas.microsoft.com/office/word/2006/wordml" xmlns:wps="http://schemas.microsoft.com/office/word/2010/wordprocessingShape" xmlns:wpsCustomData="http://www.wps.cn/officeDocument/2013/wpsCustomData" mc:Ignorable="w14 wp14">
-  <w:abstractNum w:abstractNumId="0">
+<w:numbering xmlns:wpc="http://schemas.microsoft.com/office/word/2010/wordprocessingCanvas" xmlns:cx="http://schemas.microsoft.com/office/drawing/2014/chartex" xmlns:cx1="http://schemas.microsoft.com/office/drawing/2015/9/8/chartex" xmlns:cx2="http://schemas.microsoft.com/office/drawing/2015/10/21/chartex" xmlns:cx3="http://schemas.microsoft.com/office/drawing/2016/5/9/chartex" xmlns:cx4="http://schemas.microsoft.com/office/drawing/2016/5/10/chartex" xmlns:cx5="http://schemas.microsoft.com/office/drawing/2016/5/11/chartex" xmlns:cx6="http://schemas.microsoft.com/office/drawing/2016/5/12/chartex" xmlns:cx7="http://schemas.microsoft.com/office/drawing/2016/5/13/chartex" xmlns:cx8="http://schemas.microsoft.com/office/drawing/2016/5/14/chartex" xmlns:mc="http://schemas.openxmlformats.org/markup-compatibility/2006" xmlns:aink="http://schemas.microsoft.com/office/drawing/2016/ink" xmlns:am3d="http://schemas.microsoft.com/office/drawing/2017/model3d" xmlns:o="urn:schemas-microsoft-com:office:office" xmlns:oel="http://schemas.microsoft.com/office/2019/extlst" xmlns:r="http://schemas.openxmlformats.org/officeDocument/2006/relationships" xmlns:m="http://schemas.openxmlformats.org/officeDocument/2006/math" xmlns:v="urn:schemas-microsoft-com:vml" xmlns:wp14="http://schemas.microsoft.com/office/word/2010/wordprocessingDrawing" xmlns:wp="http://schemas.openxmlformats.org/drawingml/2006/wordprocessingDrawing" xmlns:w10="urn:schemas-microsoft-com:office:word" xmlns:w="http://schemas.openxmlformats.org/wordprocessingml/2006/main" xmlns:w14="http://schemas.microsoft.com/office/word/2010/wordml" xmlns:w15="http://schemas.microsoft.com/office/word/2012/wordml" xmlns:w16cei="http://schemas.microsoft.com/office/word/2026/wordml/cei" xmlns:w16cex="http://schemas.microsoft.com/office/word/2018/wordml/cex" xmlns:w16cid="http://schemas.microsoft.com/office/word/2016/wordml/cid" xmlns:w16="http://schemas.microsoft.com/office/word/2018/wordml" xmlns:w16du="http://schemas.microsoft.com/office/word/2023/wordml/word16du" xmlns:w16sdtdh="http://schemas.microsoft.com/office/word/2020/wordml/sdtdatahash" xmlns:w16sdtfl="http://schemas.microsoft.com/office/word/2024/wordml/sdtformatlock" xmlns:w16se="http://schemas.microsoft.com/office/word/2015/wordml/symex" xmlns:wpg="http://schemas.microsoft.com/office/word/2010/wordprocessingGroup" xmlns:wpi="http://schemas.microsoft.com/office/word/2010/wordprocessingInk" xmlns:wne="http://schemas.microsoft.com/office/word/2006/wordml" xmlns:wps="http://schemas.microsoft.com/office/word/2010/wordprocessingShape" mc:Ignorable="w14 w15 w16se w16cid w16 w16cex w16sdtdh w16sdtfl w16du wp14">
+  <w:abstractNum w:abstractNumId="0" w15:restartNumberingAfterBreak="0">
     <w:nsid w:val="2ED261DB"/>
     <w:multiLevelType w:val="multilevel"/>
     <w:tmpl w:val="2ED261DB"/>
-    <w:lvl w:ilvl="0" w:tentative="0">
+    <w:lvl w:ilvl="0">
       <w:start w:val="1"/>
       <w:numFmt w:val="upperRoman"/>
       <w:lvlText w:val="%1."/>
@@ -3311,7 +3151,7 @@
         <w:lang w:val="en-US" w:eastAsia="en-US" w:bidi="ar-SA"/>
       </w:rPr>
     </w:lvl>
-    <w:lvl w:ilvl="1" w:tentative="0">
+    <w:lvl w:ilvl="1">
       <w:start w:val="1"/>
       <w:numFmt w:val="upperLetter"/>
       <w:lvlText w:val="%2."/>
@@ -3327,8 +3167,7 @@
         <w:lang w:val="en-US" w:eastAsia="en-US" w:bidi="ar-SA"/>
       </w:rPr>
     </w:lvl>
-    <w:lvl w:ilvl="2" w:tentative="0">
-      <w:start w:val="0"/>
+    <w:lvl w:ilvl="2">
       <w:numFmt w:val="bullet"/>
       <w:lvlText w:val="•"/>
       <w:lvlJc w:val="left"/>
@@ -3340,8 +3179,7 @@
         <w:lang w:val="en-US" w:eastAsia="en-US" w:bidi="ar-SA"/>
       </w:rPr>
     </w:lvl>
-    <w:lvl w:ilvl="3" w:tentative="0">
-      <w:start w:val="0"/>
+    <w:lvl w:ilvl="3">
       <w:numFmt w:val="bullet"/>
       <w:lvlText w:val="•"/>
       <w:lvlJc w:val="left"/>
@@ -3353,8 +3191,7 @@
         <w:lang w:val="en-US" w:eastAsia="en-US" w:bidi="ar-SA"/>
       </w:rPr>
     </w:lvl>
-    <w:lvl w:ilvl="4" w:tentative="0">
-      <w:start w:val="0"/>
+    <w:lvl w:ilvl="4">
       <w:numFmt w:val="bullet"/>
       <w:lvlText w:val="•"/>
       <w:lvlJc w:val="left"/>
@@ -3366,8 +3203,7 @@
         <w:lang w:val="en-US" w:eastAsia="en-US" w:bidi="ar-SA"/>
       </w:rPr>
     </w:lvl>
-    <w:lvl w:ilvl="5" w:tentative="0">
-      <w:start w:val="0"/>
+    <w:lvl w:ilvl="5">
       <w:numFmt w:val="bullet"/>
       <w:lvlText w:val="•"/>
       <w:lvlJc w:val="left"/>
@@ -3379,8 +3215,7 @@
         <w:lang w:val="en-US" w:eastAsia="en-US" w:bidi="ar-SA"/>
       </w:rPr>
     </w:lvl>
-    <w:lvl w:ilvl="6" w:tentative="0">
-      <w:start w:val="0"/>
+    <w:lvl w:ilvl="6">
       <w:numFmt w:val="bullet"/>
       <w:lvlText w:val="•"/>
       <w:lvlJc w:val="left"/>
@@ -3392,8 +3227,7 @@
         <w:lang w:val="en-US" w:eastAsia="en-US" w:bidi="ar-SA"/>
       </w:rPr>
     </w:lvl>
-    <w:lvl w:ilvl="7" w:tentative="0">
-      <w:start w:val="0"/>
+    <w:lvl w:ilvl="7">
       <w:numFmt w:val="bullet"/>
       <w:lvlText w:val="•"/>
       <w:lvlJc w:val="left"/>
@@ -3405,8 +3239,7 @@
         <w:lang w:val="en-US" w:eastAsia="en-US" w:bidi="ar-SA"/>
       </w:rPr>
     </w:lvl>
-    <w:lvl w:ilvl="8" w:tentative="0">
-      <w:start w:val="0"/>
+    <w:lvl w:ilvl="8">
       <w:numFmt w:val="bullet"/>
       <w:lvlText w:val="•"/>
       <w:lvlJc w:val="left"/>
@@ -3419,303 +3252,429 @@
       </w:rPr>
     </w:lvl>
   </w:abstractNum>
-  <w:num w:numId="1">
+  <w:num w:numId="1" w16cid:durableId="1885101090">
     <w:abstractNumId w:val="0"/>
   </w:num>
 </w:numbering>
 </file>
 
 <file path=word/styles.xml><?xml version="1.0" encoding="utf-8"?>
-<w:styles xmlns:mc="http://schemas.openxmlformats.org/markup-compatibility/2006" xmlns:o="urn:schemas-microsoft-com:office:office" xmlns:r="http://schemas.openxmlformats.org/officeDocument/2006/relationships" xmlns:m="http://schemas.openxmlformats.org/officeDocument/2006/math" xmlns:v="urn:schemas-microsoft-com:vml" xmlns:w="http://schemas.openxmlformats.org/wordprocessingml/2006/main" xmlns:w14="http://schemas.microsoft.com/office/word/2010/wordml" xmlns:w10="urn:schemas-microsoft-com:office:word" xmlns:sl="http://schemas.openxmlformats.org/schemaLibrary/2006/main" xmlns:wpsCustomData="http://www.wps.cn/officeDocument/2013/wpsCustomData" mc:Ignorable="w14">
+<w:styles xmlns:mc="http://schemas.openxmlformats.org/markup-compatibility/2006" xmlns:r="http://schemas.openxmlformats.org/officeDocument/2006/relationships" xmlns:w="http://schemas.openxmlformats.org/wordprocessingml/2006/main" xmlns:w14="http://schemas.microsoft.com/office/word/2010/wordml" xmlns:w15="http://schemas.microsoft.com/office/word/2012/wordml" xmlns:w16cex="http://schemas.microsoft.com/office/word/2018/wordml/cex" xmlns:w16cid="http://schemas.microsoft.com/office/word/2016/wordml/cid" xmlns:w16="http://schemas.microsoft.com/office/word/2018/wordml" xmlns:w16du="http://schemas.microsoft.com/office/word/2023/wordml/word16du" xmlns:w16sdtdh="http://schemas.microsoft.com/office/word/2020/wordml/sdtdatahash" xmlns:w16sdtfl="http://schemas.microsoft.com/office/word/2024/wordml/sdtformatlock" xmlns:w16se="http://schemas.microsoft.com/office/word/2015/wordml/symex" mc:Ignorable="w14 w15 w16se w16cid w16 w16cex w16sdtdh w16sdtfl w16du">
   <w:docDefaults>
     <w:rPrDefault>
       <w:rPr>
-        <w:rFonts w:asciiTheme="minorHAnsi" w:hAnsiTheme="minorHAnsi" w:eastAsiaTheme="minorHAnsi" w:cstheme="minorBidi"/>
+        <w:rFonts w:asciiTheme="minorHAnsi" w:eastAsiaTheme="minorHAnsi" w:hAnsiTheme="minorHAnsi" w:cstheme="minorBidi"/>
+        <w:lang w:val="en-IN" w:eastAsia="en-IN" w:bidi="ar-SA"/>
       </w:rPr>
     </w:rPrDefault>
     <w:pPrDefault/>
   </w:docDefaults>
-  <w:latentStyles w:count="260" w:defQFormat="0" w:defUnhideWhenUsed="1" w:defSemiHidden="1" w:defUIPriority="99" w:defLockedState="0">
-    <w:lsdException w:qFormat="1" w:unhideWhenUsed="0" w:uiPriority="1" w:semiHidden="0" w:name="Normal"/>
-    <w:lsdException w:qFormat="1" w:unhideWhenUsed="0" w:uiPriority="9" w:semiHidden="0" w:name="heading 1"/>
-    <w:lsdException w:qFormat="1" w:uiPriority="9" w:name="heading 2"/>
-    <w:lsdException w:qFormat="1" w:uiPriority="9" w:name="heading 3"/>
-    <w:lsdException w:qFormat="1" w:uiPriority="9" w:name="heading 4"/>
-    <w:lsdException w:qFormat="1" w:uiPriority="9" w:name="heading 5"/>
-    <w:lsdException w:qFormat="1" w:uiPriority="9" w:name="heading 6"/>
-    <w:lsdException w:qFormat="1" w:uiPriority="9" w:name="heading 7"/>
-    <w:lsdException w:qFormat="1" w:uiPriority="9" w:name="heading 8"/>
-    <w:lsdException w:qFormat="1" w:uiPriority="9" w:name="heading 9"/>
-    <w:lsdException w:uiPriority="99" w:name="index 1"/>
-    <w:lsdException w:uiPriority="99" w:name="index 2"/>
-    <w:lsdException w:uiPriority="99" w:name="index 3"/>
-    <w:lsdException w:uiPriority="99" w:name="index 4"/>
-    <w:lsdException w:uiPriority="99" w:name="index 5"/>
-    <w:lsdException w:uiPriority="99" w:name="index 6"/>
-    <w:lsdException w:uiPriority="99" w:name="index 7"/>
-    <w:lsdException w:uiPriority="99" w:name="index 8"/>
-    <w:lsdException w:uiPriority="99" w:name="index 9"/>
-    <w:lsdException w:uiPriority="39" w:name="toc 1"/>
-    <w:lsdException w:uiPriority="39" w:name="toc 2"/>
-    <w:lsdException w:uiPriority="39" w:name="toc 3"/>
-    <w:lsdException w:uiPriority="39" w:name="toc 4"/>
-    <w:lsdException w:uiPriority="39" w:name="toc 5"/>
-    <w:lsdException w:uiPriority="39" w:name="toc 6"/>
-    <w:lsdException w:uiPriority="39" w:name="toc 7"/>
-    <w:lsdException w:uiPriority="39" w:name="toc 8"/>
-    <w:lsdException w:uiPriority="39" w:name="toc 9"/>
-    <w:lsdException w:uiPriority="99" w:name="Normal Indent"/>
-    <w:lsdException w:uiPriority="99" w:name="footnote text"/>
-    <w:lsdException w:uiPriority="99" w:name="annotation text"/>
-    <w:lsdException w:uiPriority="99" w:name="header"/>
-    <w:lsdException w:uiPriority="99" w:name="footer"/>
-    <w:lsdException w:uiPriority="99" w:name="index heading"/>
-    <w:lsdException w:qFormat="1" w:uiPriority="35" w:name="caption"/>
-    <w:lsdException w:uiPriority="99" w:name="table of figures"/>
-    <w:lsdException w:uiPriority="99" w:name="envelope address"/>
-    <w:lsdException w:uiPriority="99" w:name="envelope return"/>
-    <w:lsdException w:uiPriority="99" w:name="footnote reference"/>
-    <w:lsdException w:uiPriority="99" w:name="annotation reference"/>
-    <w:lsdException w:uiPriority="99" w:name="line number"/>
-    <w:lsdException w:uiPriority="99" w:name="page number"/>
-    <w:lsdException w:uiPriority="99" w:name="endnote reference"/>
-    <w:lsdException w:uiPriority="99" w:name="endnote text"/>
-    <w:lsdException w:uiPriority="99" w:name="table of authorities"/>
-    <w:lsdException w:uiPriority="99" w:name="macro"/>
-    <w:lsdException w:uiPriority="99" w:name="toa heading"/>
-    <w:lsdException w:uiPriority="99" w:name="List"/>
-    <w:lsdException w:uiPriority="99" w:name="List Bullet"/>
-    <w:lsdException w:uiPriority="99" w:name="List Number"/>
-    <w:lsdException w:uiPriority="99" w:name="List 2"/>
-    <w:lsdException w:uiPriority="99" w:name="List 3"/>
-    <w:lsdException w:uiPriority="99" w:name="List 4"/>
-    <w:lsdException w:uiPriority="99" w:name="List 5"/>
-    <w:lsdException w:uiPriority="99" w:name="List Bullet 2"/>
-    <w:lsdException w:uiPriority="99" w:name="List Bullet 3"/>
-    <w:lsdException w:uiPriority="99" w:name="List Bullet 4"/>
-    <w:lsdException w:uiPriority="99" w:name="List Bullet 5"/>
-    <w:lsdException w:uiPriority="99" w:name="List Number 2"/>
-    <w:lsdException w:uiPriority="99" w:name="List Number 3"/>
-    <w:lsdException w:uiPriority="99" w:name="List Number 4"/>
-    <w:lsdException w:uiPriority="99" w:name="List Number 5"/>
-    <w:lsdException w:qFormat="1" w:unhideWhenUsed="0" w:uiPriority="10" w:semiHidden="0" w:name="Title"/>
-    <w:lsdException w:uiPriority="99" w:name="Closing"/>
-    <w:lsdException w:uiPriority="99" w:name="Signature"/>
-    <w:lsdException w:qFormat="1" w:uiPriority="1" w:name="Default Paragraph Font"/>
-    <w:lsdException w:uiPriority="99" w:name="Body Text"/>
-    <w:lsdException w:uiPriority="99" w:name="Body Text Indent"/>
-    <w:lsdException w:uiPriority="99" w:name="List Continue"/>
-    <w:lsdException w:uiPriority="99" w:name="List Continue 2"/>
-    <w:lsdException w:uiPriority="99" w:name="List Continue 3"/>
-    <w:lsdException w:uiPriority="99" w:name="List Continue 4"/>
-    <w:lsdException w:uiPriority="99" w:name="List Continue 5"/>
-    <w:lsdException w:uiPriority="99" w:name="Message Header"/>
-    <w:lsdException w:qFormat="1" w:unhideWhenUsed="0" w:uiPriority="11" w:semiHidden="0" w:name="Subtitle"/>
-    <w:lsdException w:uiPriority="99" w:name="Salutation"/>
-    <w:lsdException w:uiPriority="99" w:name="Date"/>
-    <w:lsdException w:uiPriority="99" w:name="Body Text First Indent"/>
-    <w:lsdException w:uiPriority="99" w:name="Body Text First Indent 2"/>
-    <w:lsdException w:uiPriority="99" w:name="Note Heading"/>
-    <w:lsdException w:uiPriority="99" w:name="Body Text 2"/>
-    <w:lsdException w:uiPriority="99" w:name="Body Text 3"/>
-    <w:lsdException w:uiPriority="99" w:name="Body Text Indent 2"/>
-    <w:lsdException w:uiPriority="99" w:name="Body Text Indent 3"/>
-    <w:lsdException w:uiPriority="99" w:name="Block Text"/>
-    <w:lsdException w:uiPriority="99" w:name="Hyperlink"/>
-    <w:lsdException w:uiPriority="99" w:name="FollowedHyperlink"/>
-    <w:lsdException w:qFormat="1" w:unhideWhenUsed="0" w:uiPriority="22" w:semiHidden="0" w:name="Strong"/>
-    <w:lsdException w:qFormat="1" w:unhideWhenUsed="0" w:uiPriority="20" w:semiHidden="0" w:name="Emphasis"/>
-    <w:lsdException w:uiPriority="99" w:name="Document Map"/>
-    <w:lsdException w:uiPriority="99" w:name="Plain Text"/>
-    <w:lsdException w:uiPriority="99" w:name="E-mail Signature"/>
-    <w:lsdException w:uiPriority="99" w:name="Normal (Web)"/>
-    <w:lsdException w:uiPriority="99" w:name="HTML Acronym"/>
-    <w:lsdException w:uiPriority="99" w:name="HTML Address"/>
-    <w:lsdException w:uiPriority="99" w:name="HTML Cite"/>
-    <w:lsdException w:uiPriority="99" w:name="HTML Code"/>
-    <w:lsdException w:uiPriority="99" w:name="HTML Definition"/>
-    <w:lsdException w:uiPriority="99" w:name="HTML Keyboard"/>
-    <w:lsdException w:uiPriority="99" w:name="HTML Preformatted"/>
-    <w:lsdException w:uiPriority="99" w:name="HTML Sample"/>
-    <w:lsdException w:uiPriority="99" w:name="HTML Typewriter"/>
-    <w:lsdException w:uiPriority="99" w:name="HTML Variable"/>
-    <w:lsdException w:qFormat="1" w:uiPriority="99" w:name="Normal Table"/>
-    <w:lsdException w:uiPriority="99" w:name="annotation subject"/>
-    <w:lsdException w:uiPriority="99" w:name="Table Simple 1"/>
-    <w:lsdException w:uiPriority="99" w:name="Table Simple 2"/>
-    <w:lsdException w:uiPriority="99" w:name="Table Simple 3"/>
-    <w:lsdException w:uiPriority="99" w:name="Table Classic 1"/>
-    <w:lsdException w:uiPriority="99" w:name="Table Classic 2"/>
-    <w:lsdException w:uiPriority="99" w:name="Table Classic 3"/>
-    <w:lsdException w:uiPriority="99" w:name="Table Classic 4"/>
-    <w:lsdException w:uiPriority="99" w:name="Table Colorful 1"/>
-    <w:lsdException w:uiPriority="99" w:name="Table Colorful 2"/>
-    <w:lsdException w:uiPriority="99" w:name="Table Colorful 3"/>
-    <w:lsdException w:uiPriority="99" w:name="Table Columns 1"/>
-    <w:lsdException w:uiPriority="99" w:name="Table Columns 2"/>
-    <w:lsdException w:uiPriority="99" w:name="Table Columns 3"/>
-    <w:lsdException w:uiPriority="99" w:name="Table Columns 4"/>
-    <w:lsdException w:uiPriority="99" w:name="Table Columns 5"/>
-    <w:lsdException w:uiPriority="99" w:name="Table Grid 1"/>
-    <w:lsdException w:uiPriority="99" w:name="Table Grid 2"/>
-    <w:lsdException w:uiPriority="99" w:name="Table Grid 3"/>
-    <w:lsdException w:uiPriority="99" w:name="Table Grid 4"/>
-    <w:lsdException w:uiPriority="99" w:name="Table Grid 5"/>
-    <w:lsdException w:uiPriority="99" w:name="Table Grid 6"/>
-    <w:lsdException w:uiPriority="99" w:name="Table Grid 7"/>
-    <w:lsdException w:uiPriority="99" w:name="Table Grid 8"/>
-    <w:lsdException w:uiPriority="99" w:name="Table List 1"/>
-    <w:lsdException w:uiPriority="99" w:name="Table List 2"/>
-    <w:lsdException w:uiPriority="99" w:name="Table List 3"/>
-    <w:lsdException w:uiPriority="99" w:name="Table List 4"/>
-    <w:lsdException w:uiPriority="99" w:name="Table List 5"/>
-    <w:lsdException w:uiPriority="99" w:name="Table List 6"/>
-    <w:lsdException w:uiPriority="99" w:name="Table List 7"/>
-    <w:lsdException w:uiPriority="99" w:name="Table List 8"/>
-    <w:lsdException w:uiPriority="99" w:name="Table 3D effects 1"/>
-    <w:lsdException w:uiPriority="99" w:name="Table 3D effects 2"/>
-    <w:lsdException w:uiPriority="99" w:name="Table 3D effects 3"/>
-    <w:lsdException w:uiPriority="99" w:name="Table Contemporary"/>
-    <w:lsdException w:uiPriority="99" w:name="Table Elegant"/>
-    <w:lsdException w:uiPriority="99" w:name="Table Professional"/>
-    <w:lsdException w:uiPriority="99" w:name="Table Subtle 1"/>
-    <w:lsdException w:uiPriority="99" w:name="Table Subtle 2"/>
-    <w:lsdException w:uiPriority="99" w:name="Table Web 1"/>
-    <w:lsdException w:uiPriority="99" w:name="Table Web 2"/>
-    <w:lsdException w:uiPriority="99" w:name="Table Web 3"/>
-    <w:lsdException w:uiPriority="99" w:name="Balloon Text"/>
-    <w:lsdException w:qFormat="1" w:unhideWhenUsed="0" w:uiPriority="59" w:semiHidden="0" w:name="Table Grid"/>
-    <w:lsdException w:uiPriority="99" w:name="Table Theme"/>
-    <w:lsdException w:unhideWhenUsed="0" w:uiPriority="60" w:semiHidden="0" w:name="Light Shading"/>
-    <w:lsdException w:unhideWhenUsed="0" w:uiPriority="61" w:semiHidden="0" w:name="Light List"/>
-    <w:lsdException w:unhideWhenUsed="0" w:uiPriority="62" w:semiHidden="0" w:name="Light Grid"/>
-    <w:lsdException w:unhideWhenUsed="0" w:uiPriority="63" w:semiHidden="0" w:name="Medium Shading 1"/>
-    <w:lsdException w:unhideWhenUsed="0" w:uiPriority="64" w:semiHidden="0" w:name="Medium Shading 2"/>
-    <w:lsdException w:unhideWhenUsed="0" w:uiPriority="65" w:semiHidden="0" w:name="Medium List 1"/>
-    <w:lsdException w:unhideWhenUsed="0" w:uiPriority="66" w:semiHidden="0" w:name="Medium List 2"/>
-    <w:lsdException w:unhideWhenUsed="0" w:uiPriority="67" w:semiHidden="0" w:name="Medium Grid 1"/>
-    <w:lsdException w:unhideWhenUsed="0" w:uiPriority="68" w:semiHidden="0" w:name="Medium Grid 2"/>
-    <w:lsdException w:unhideWhenUsed="0" w:uiPriority="69" w:semiHidden="0" w:name="Medium Grid 3"/>
-    <w:lsdException w:unhideWhenUsed="0" w:uiPriority="70" w:semiHidden="0" w:name="Dark List"/>
-    <w:lsdException w:unhideWhenUsed="0" w:uiPriority="71" w:semiHidden="0" w:name="Colorful Shading"/>
-    <w:lsdException w:unhideWhenUsed="0" w:uiPriority="72" w:semiHidden="0" w:name="Colorful List"/>
-    <w:lsdException w:unhideWhenUsed="0" w:uiPriority="73" w:semiHidden="0" w:name="Colorful Grid"/>
-    <w:lsdException w:unhideWhenUsed="0" w:uiPriority="60" w:semiHidden="0" w:name="Light Shading Accent 1"/>
-    <w:lsdException w:unhideWhenUsed="0" w:uiPriority="61" w:semiHidden="0" w:name="Light List Accent 1"/>
-    <w:lsdException w:unhideWhenUsed="0" w:uiPriority="62" w:semiHidden="0" w:name="Light Grid Accent 1"/>
-    <w:lsdException w:unhideWhenUsed="0" w:uiPriority="63" w:semiHidden="0" w:name="Medium Shading 1 Accent 1"/>
-    <w:lsdException w:unhideWhenUsed="0" w:uiPriority="64" w:semiHidden="0" w:name="Medium Shading 2 Accent 1"/>
-    <w:lsdException w:unhideWhenUsed="0" w:uiPriority="65" w:semiHidden="0" w:name="Medium List 1 Accent 1"/>
-    <w:lsdException w:qFormat="1" w:unhideWhenUsed="0" w:uiPriority="1" w:semiHidden="0" w:name="List Paragraph"/>
-    <w:lsdException w:unhideWhenUsed="0" w:uiPriority="66" w:semiHidden="0" w:name="Medium List 2 Accent 1"/>
-    <w:lsdException w:unhideWhenUsed="0" w:uiPriority="67" w:semiHidden="0" w:name="Medium Grid 1 Accent 1"/>
-    <w:lsdException w:unhideWhenUsed="0" w:uiPriority="68" w:semiHidden="0" w:name="Medium Grid 2 Accent 1"/>
-    <w:lsdException w:unhideWhenUsed="0" w:uiPriority="69" w:semiHidden="0" w:name="Medium Grid 3 Accent 1"/>
-    <w:lsdException w:unhideWhenUsed="0" w:uiPriority="70" w:semiHidden="0" w:name="Dark List Accent 1"/>
-    <w:lsdException w:unhideWhenUsed="0" w:uiPriority="71" w:semiHidden="0" w:name="Colorful Shading Accent 1"/>
-    <w:lsdException w:unhideWhenUsed="0" w:uiPriority="72" w:semiHidden="0" w:name="Colorful List Accent 1"/>
-    <w:lsdException w:unhideWhenUsed="0" w:uiPriority="73" w:semiHidden="0" w:name="Colorful Grid Accent 1"/>
-    <w:lsdException w:unhideWhenUsed="0" w:uiPriority="60" w:semiHidden="0" w:name="Light Shading Accent 2"/>
-    <w:lsdException w:unhideWhenUsed="0" w:uiPriority="61" w:semiHidden="0" w:name="Light List Accent 2"/>
-    <w:lsdException w:unhideWhenUsed="0" w:uiPriority="62" w:semiHidden="0" w:name="Light Grid Accent 2"/>
-    <w:lsdException w:unhideWhenUsed="0" w:uiPriority="63" w:semiHidden="0" w:name="Medium Shading 1 Accent 2"/>
-    <w:lsdException w:unhideWhenUsed="0" w:uiPriority="64" w:semiHidden="0" w:name="Medium Shading 2 Accent 2"/>
-    <w:lsdException w:unhideWhenUsed="0" w:uiPriority="65" w:semiHidden="0" w:name="Medium List 1 Accent 2"/>
-    <w:lsdException w:unhideWhenUsed="0" w:uiPriority="66" w:semiHidden="0" w:name="Medium List 2 Accent 2"/>
-    <w:lsdException w:unhideWhenUsed="0" w:uiPriority="67" w:semiHidden="0" w:name="Medium Grid 1 Accent 2"/>
-    <w:lsdException w:unhideWhenUsed="0" w:uiPriority="68" w:semiHidden="0" w:name="Medium Grid 2 Accent 2"/>
-    <w:lsdException w:unhideWhenUsed="0" w:uiPriority="69" w:semiHidden="0" w:name="Medium Grid 3 Accent 2"/>
-    <w:lsdException w:unhideWhenUsed="0" w:uiPriority="70" w:semiHidden="0" w:name="Dark List Accent 2"/>
-    <w:lsdException w:unhideWhenUsed="0" w:uiPriority="71" w:semiHidden="0" w:name="Colorful Shading Accent 2"/>
-    <w:lsdException w:unhideWhenUsed="0" w:uiPriority="72" w:semiHidden="0" w:name="Colorful List Accent 2"/>
-    <w:lsdException w:unhideWhenUsed="0" w:uiPriority="73" w:semiHidden="0" w:name="Colorful Grid Accent 2"/>
-    <w:lsdException w:unhideWhenUsed="0" w:uiPriority="60" w:semiHidden="0" w:name="Light Shading Accent 3"/>
-    <w:lsdException w:unhideWhenUsed="0" w:uiPriority="61" w:semiHidden="0" w:name="Light List Accent 3"/>
-    <w:lsdException w:unhideWhenUsed="0" w:uiPriority="62" w:semiHidden="0" w:name="Light Grid Accent 3"/>
-    <w:lsdException w:unhideWhenUsed="0" w:uiPriority="63" w:semiHidden="0" w:name="Medium Shading 1 Accent 3"/>
-    <w:lsdException w:unhideWhenUsed="0" w:uiPriority="64" w:semiHidden="0" w:name="Medium Shading 2 Accent 3"/>
-    <w:lsdException w:unhideWhenUsed="0" w:uiPriority="65" w:semiHidden="0" w:name="Medium List 1 Accent 3"/>
-    <w:lsdException w:unhideWhenUsed="0" w:uiPriority="66" w:semiHidden="0" w:name="Medium List 2 Accent 3"/>
-    <w:lsdException w:unhideWhenUsed="0" w:uiPriority="67" w:semiHidden="0" w:name="Medium Grid 1 Accent 3"/>
-    <w:lsdException w:unhideWhenUsed="0" w:uiPriority="68" w:semiHidden="0" w:name="Medium Grid 2 Accent 3"/>
-    <w:lsdException w:unhideWhenUsed="0" w:uiPriority="69" w:semiHidden="0" w:name="Medium Grid 3 Accent 3"/>
-    <w:lsdException w:unhideWhenUsed="0" w:uiPriority="70" w:semiHidden="0" w:name="Dark List Accent 3"/>
-    <w:lsdException w:unhideWhenUsed="0" w:uiPriority="71" w:semiHidden="0" w:name="Colorful Shading Accent 3"/>
-    <w:lsdException w:unhideWhenUsed="0" w:uiPriority="72" w:semiHidden="0" w:name="Colorful List Accent 3"/>
-    <w:lsdException w:unhideWhenUsed="0" w:uiPriority="73" w:semiHidden="0" w:name="Colorful Grid Accent 3"/>
-    <w:lsdException w:unhideWhenUsed="0" w:uiPriority="60" w:semiHidden="0" w:name="Light Shading Accent 4"/>
-    <w:lsdException w:unhideWhenUsed="0" w:uiPriority="61" w:semiHidden="0" w:name="Light List Accent 4"/>
-    <w:lsdException w:unhideWhenUsed="0" w:uiPriority="62" w:semiHidden="0" w:name="Light Grid Accent 4"/>
-    <w:lsdException w:unhideWhenUsed="0" w:uiPriority="63" w:semiHidden="0" w:name="Medium Shading 1 Accent 4"/>
-    <w:lsdException w:unhideWhenUsed="0" w:uiPriority="64" w:semiHidden="0" w:name="Medium Shading 2 Accent 4"/>
-    <w:lsdException w:unhideWhenUsed="0" w:uiPriority="65" w:semiHidden="0" w:name="Medium List 1 Accent 4"/>
-    <w:lsdException w:unhideWhenUsed="0" w:uiPriority="66" w:semiHidden="0" w:name="Medium List 2 Accent 4"/>
-    <w:lsdException w:unhideWhenUsed="0" w:uiPriority="67" w:semiHidden="0" w:name="Medium Grid 1 Accent 4"/>
-    <w:lsdException w:unhideWhenUsed="0" w:uiPriority="68" w:semiHidden="0" w:name="Medium Grid 2 Accent 4"/>
-    <w:lsdException w:unhideWhenUsed="0" w:uiPriority="69" w:semiHidden="0" w:name="Medium Grid 3 Accent 4"/>
-    <w:lsdException w:unhideWhenUsed="0" w:uiPriority="70" w:semiHidden="0" w:name="Dark List Accent 4"/>
-    <w:lsdException w:unhideWhenUsed="0" w:uiPriority="71" w:semiHidden="0" w:name="Colorful Shading Accent 4"/>
-    <w:lsdException w:unhideWhenUsed="0" w:uiPriority="72" w:semiHidden="0" w:name="Colorful List Accent 4"/>
-    <w:lsdException w:unhideWhenUsed="0" w:uiPriority="73" w:semiHidden="0" w:name="Colorful Grid Accent 4"/>
-    <w:lsdException w:unhideWhenUsed="0" w:uiPriority="60" w:semiHidden="0" w:name="Light Shading Accent 5"/>
-    <w:lsdException w:unhideWhenUsed="0" w:uiPriority="61" w:semiHidden="0" w:name="Light List Accent 5"/>
-    <w:lsdException w:unhideWhenUsed="0" w:uiPriority="62" w:semiHidden="0" w:name="Light Grid Accent 5"/>
-    <w:lsdException w:unhideWhenUsed="0" w:uiPriority="63" w:semiHidden="0" w:name="Medium Shading 1 Accent 5"/>
-    <w:lsdException w:unhideWhenUsed="0" w:uiPriority="64" w:semiHidden="0" w:name="Medium Shading 2 Accent 5"/>
-    <w:lsdException w:unhideWhenUsed="0" w:uiPriority="65" w:semiHidden="0" w:name="Medium List 1 Accent 5"/>
-    <w:lsdException w:unhideWhenUsed="0" w:uiPriority="66" w:semiHidden="0" w:name="Medium List 2 Accent 5"/>
-    <w:lsdException w:unhideWhenUsed="0" w:uiPriority="67" w:semiHidden="0" w:name="Medium Grid 1 Accent 5"/>
-    <w:lsdException w:unhideWhenUsed="0" w:uiPriority="68" w:semiHidden="0" w:name="Medium Grid 2 Accent 5"/>
-    <w:lsdException w:unhideWhenUsed="0" w:uiPriority="69" w:semiHidden="0" w:name="Medium Grid 3 Accent 5"/>
-    <w:lsdException w:unhideWhenUsed="0" w:uiPriority="70" w:semiHidden="0" w:name="Dark List Accent 5"/>
-    <w:lsdException w:unhideWhenUsed="0" w:uiPriority="71" w:semiHidden="0" w:name="Colorful Shading Accent 5"/>
-    <w:lsdException w:unhideWhenUsed="0" w:uiPriority="72" w:semiHidden="0" w:name="Colorful List Accent 5"/>
-    <w:lsdException w:unhideWhenUsed="0" w:uiPriority="73" w:semiHidden="0" w:name="Colorful Grid Accent 5"/>
-    <w:lsdException w:unhideWhenUsed="0" w:uiPriority="60" w:semiHidden="0" w:name="Light Shading Accent 6"/>
-    <w:lsdException w:unhideWhenUsed="0" w:uiPriority="61" w:semiHidden="0" w:name="Light List Accent 6"/>
-    <w:lsdException w:unhideWhenUsed="0" w:uiPriority="62" w:semiHidden="0" w:name="Light Grid Accent 6"/>
-    <w:lsdException w:unhideWhenUsed="0" w:uiPriority="63" w:semiHidden="0" w:name="Medium Shading 1 Accent 6"/>
-    <w:lsdException w:unhideWhenUsed="0" w:uiPriority="64" w:semiHidden="0" w:name="Medium Shading 2 Accent 6"/>
-    <w:lsdException w:unhideWhenUsed="0" w:uiPriority="65" w:semiHidden="0" w:name="Medium List 1 Accent 6"/>
-    <w:lsdException w:unhideWhenUsed="0" w:uiPriority="66" w:semiHidden="0" w:name="Medium List 2 Accent 6"/>
-    <w:lsdException w:unhideWhenUsed="0" w:uiPriority="67" w:semiHidden="0" w:name="Medium Grid 1 Accent 6"/>
-    <w:lsdException w:unhideWhenUsed="0" w:uiPriority="68" w:semiHidden="0" w:name="Medium Grid 2 Accent 6"/>
-    <w:lsdException w:unhideWhenUsed="0" w:uiPriority="69" w:semiHidden="0" w:name="Medium Grid 3 Accent 6"/>
-    <w:lsdException w:unhideWhenUsed="0" w:uiPriority="70" w:semiHidden="0" w:name="Dark List Accent 6"/>
-    <w:lsdException w:unhideWhenUsed="0" w:uiPriority="71" w:semiHidden="0" w:name="Colorful Shading Accent 6"/>
-    <w:lsdException w:unhideWhenUsed="0" w:uiPriority="72" w:semiHidden="0" w:name="Colorful List Accent 6"/>
-    <w:lsdException w:unhideWhenUsed="0" w:uiPriority="73" w:semiHidden="0" w:name="Colorful Grid Accent 6"/>
+  <w:latentStyles w:defLockedState="0" w:defUIPriority="99" w:defSemiHidden="0" w:defUnhideWhenUsed="0" w:defQFormat="0" w:count="376">
+    <w:lsdException w:name="Normal" w:uiPriority="1" w:qFormat="1"/>
+    <w:lsdException w:name="heading 1" w:uiPriority="9" w:qFormat="1"/>
+    <w:lsdException w:name="heading 2" w:semiHidden="1" w:uiPriority="9" w:unhideWhenUsed="1" w:qFormat="1"/>
+    <w:lsdException w:name="heading 3" w:semiHidden="1" w:uiPriority="9" w:unhideWhenUsed="1" w:qFormat="1"/>
+    <w:lsdException w:name="heading 4" w:semiHidden="1" w:uiPriority="9" w:unhideWhenUsed="1" w:qFormat="1"/>
+    <w:lsdException w:name="heading 5" w:semiHidden="1" w:uiPriority="9" w:unhideWhenUsed="1" w:qFormat="1"/>
+    <w:lsdException w:name="heading 6" w:semiHidden="1" w:uiPriority="9" w:unhideWhenUsed="1" w:qFormat="1"/>
+    <w:lsdException w:name="heading 7" w:semiHidden="1" w:uiPriority="9" w:unhideWhenUsed="1" w:qFormat="1"/>
+    <w:lsdException w:name="heading 8" w:semiHidden="1" w:uiPriority="9" w:unhideWhenUsed="1" w:qFormat="1"/>
+    <w:lsdException w:name="heading 9" w:semiHidden="1" w:uiPriority="9" w:unhideWhenUsed="1" w:qFormat="1"/>
+    <w:lsdException w:name="index 1" w:semiHidden="1" w:unhideWhenUsed="1"/>
+    <w:lsdException w:name="index 2" w:semiHidden="1" w:unhideWhenUsed="1"/>
+    <w:lsdException w:name="index 3" w:semiHidden="1" w:unhideWhenUsed="1"/>
+    <w:lsdException w:name="index 4" w:semiHidden="1" w:unhideWhenUsed="1"/>
+    <w:lsdException w:name="index 5" w:semiHidden="1" w:unhideWhenUsed="1"/>
+    <w:lsdException w:name="index 6" w:semiHidden="1" w:unhideWhenUsed="1"/>
+    <w:lsdException w:name="index 7" w:semiHidden="1" w:unhideWhenUsed="1"/>
+    <w:lsdException w:name="index 8" w:semiHidden="1" w:unhideWhenUsed="1"/>
+    <w:lsdException w:name="index 9" w:semiHidden="1" w:unhideWhenUsed="1"/>
+    <w:lsdException w:name="toc 1" w:semiHidden="1" w:uiPriority="39" w:unhideWhenUsed="1"/>
+    <w:lsdException w:name="toc 2" w:semiHidden="1" w:uiPriority="39" w:unhideWhenUsed="1"/>
+    <w:lsdException w:name="toc 3" w:semiHidden="1" w:uiPriority="39" w:unhideWhenUsed="1"/>
+    <w:lsdException w:name="toc 4" w:semiHidden="1" w:uiPriority="39" w:unhideWhenUsed="1"/>
+    <w:lsdException w:name="toc 5" w:semiHidden="1" w:uiPriority="39" w:unhideWhenUsed="1"/>
+    <w:lsdException w:name="toc 6" w:semiHidden="1" w:uiPriority="39" w:unhideWhenUsed="1"/>
+    <w:lsdException w:name="toc 7" w:semiHidden="1" w:uiPriority="39" w:unhideWhenUsed="1"/>
+    <w:lsdException w:name="toc 8" w:semiHidden="1" w:uiPriority="39" w:unhideWhenUsed="1"/>
+    <w:lsdException w:name="toc 9" w:semiHidden="1" w:uiPriority="39" w:unhideWhenUsed="1"/>
+    <w:lsdException w:name="Normal Indent" w:semiHidden="1" w:unhideWhenUsed="1"/>
+    <w:lsdException w:name="footnote text" w:semiHidden="1" w:unhideWhenUsed="1"/>
+    <w:lsdException w:name="annotation text" w:semiHidden="1" w:unhideWhenUsed="1"/>
+    <w:lsdException w:name="header" w:semiHidden="1" w:unhideWhenUsed="1"/>
+    <w:lsdException w:name="footer" w:semiHidden="1" w:unhideWhenUsed="1"/>
+    <w:lsdException w:name="index heading" w:semiHidden="1" w:unhideWhenUsed="1"/>
+    <w:lsdException w:name="caption" w:semiHidden="1" w:uiPriority="35" w:unhideWhenUsed="1" w:qFormat="1"/>
+    <w:lsdException w:name="table of figures" w:semiHidden="1" w:unhideWhenUsed="1"/>
+    <w:lsdException w:name="envelope address" w:semiHidden="1" w:unhideWhenUsed="1"/>
+    <w:lsdException w:name="envelope return" w:semiHidden="1" w:unhideWhenUsed="1"/>
+    <w:lsdException w:name="footnote reference" w:semiHidden="1" w:unhideWhenUsed="1"/>
+    <w:lsdException w:name="annotation reference" w:semiHidden="1" w:unhideWhenUsed="1"/>
+    <w:lsdException w:name="line number" w:semiHidden="1" w:unhideWhenUsed="1"/>
+    <w:lsdException w:name="page number" w:semiHidden="1" w:unhideWhenUsed="1"/>
+    <w:lsdException w:name="endnote reference" w:semiHidden="1" w:unhideWhenUsed="1"/>
+    <w:lsdException w:name="endnote text" w:semiHidden="1" w:unhideWhenUsed="1"/>
+    <w:lsdException w:name="table of authorities" w:semiHidden="1" w:unhideWhenUsed="1"/>
+    <w:lsdException w:name="macro" w:semiHidden="1" w:unhideWhenUsed="1"/>
+    <w:lsdException w:name="toa heading" w:semiHidden="1" w:unhideWhenUsed="1"/>
+    <w:lsdException w:name="List" w:semiHidden="1" w:unhideWhenUsed="1"/>
+    <w:lsdException w:name="List Bullet" w:semiHidden="1" w:unhideWhenUsed="1"/>
+    <w:lsdException w:name="List Number" w:semiHidden="1" w:unhideWhenUsed="1"/>
+    <w:lsdException w:name="List 2" w:semiHidden="1" w:unhideWhenUsed="1"/>
+    <w:lsdException w:name="List 3" w:semiHidden="1" w:unhideWhenUsed="1"/>
+    <w:lsdException w:name="List 4" w:semiHidden="1" w:unhideWhenUsed="1"/>
+    <w:lsdException w:name="List 5" w:semiHidden="1" w:unhideWhenUsed="1"/>
+    <w:lsdException w:name="List Bullet 2" w:semiHidden="1" w:unhideWhenUsed="1"/>
+    <w:lsdException w:name="List Bullet 3" w:semiHidden="1" w:unhideWhenUsed="1"/>
+    <w:lsdException w:name="List Bullet 4" w:semiHidden="1" w:unhideWhenUsed="1"/>
+    <w:lsdException w:name="List Bullet 5" w:semiHidden="1" w:unhideWhenUsed="1"/>
+    <w:lsdException w:name="List Number 2" w:semiHidden="1" w:unhideWhenUsed="1"/>
+    <w:lsdException w:name="List Number 3" w:semiHidden="1" w:unhideWhenUsed="1"/>
+    <w:lsdException w:name="List Number 4" w:semiHidden="1" w:unhideWhenUsed="1"/>
+    <w:lsdException w:name="List Number 5" w:semiHidden="1" w:unhideWhenUsed="1"/>
+    <w:lsdException w:name="Title" w:uiPriority="10" w:qFormat="1"/>
+    <w:lsdException w:name="Closing" w:semiHidden="1" w:unhideWhenUsed="1"/>
+    <w:lsdException w:name="Signature" w:semiHidden="1" w:unhideWhenUsed="1"/>
+    <w:lsdException w:name="Default Paragraph Font" w:semiHidden="1" w:uiPriority="1" w:unhideWhenUsed="1" w:qFormat="1"/>
+    <w:lsdException w:name="Body Text" w:semiHidden="1" w:unhideWhenUsed="1"/>
+    <w:lsdException w:name="Body Text Indent" w:semiHidden="1" w:unhideWhenUsed="1"/>
+    <w:lsdException w:name="List Continue" w:semiHidden="1" w:unhideWhenUsed="1"/>
+    <w:lsdException w:name="List Continue 2" w:semiHidden="1" w:unhideWhenUsed="1"/>
+    <w:lsdException w:name="List Continue 3" w:semiHidden="1" w:unhideWhenUsed="1"/>
+    <w:lsdException w:name="List Continue 4" w:semiHidden="1" w:unhideWhenUsed="1"/>
+    <w:lsdException w:name="List Continue 5" w:semiHidden="1" w:unhideWhenUsed="1"/>
+    <w:lsdException w:name="Message Header" w:semiHidden="1" w:unhideWhenUsed="1"/>
+    <w:lsdException w:name="Subtitle" w:uiPriority="11" w:qFormat="1"/>
+    <w:lsdException w:name="Salutation" w:semiHidden="1" w:unhideWhenUsed="1"/>
+    <w:lsdException w:name="Date" w:semiHidden="1" w:unhideWhenUsed="1"/>
+    <w:lsdException w:name="Body Text First Indent" w:semiHidden="1" w:unhideWhenUsed="1"/>
+    <w:lsdException w:name="Body Text First Indent 2" w:semiHidden="1" w:unhideWhenUsed="1"/>
+    <w:lsdException w:name="Note Heading" w:semiHidden="1" w:unhideWhenUsed="1"/>
+    <w:lsdException w:name="Body Text 2" w:semiHidden="1" w:unhideWhenUsed="1"/>
+    <w:lsdException w:name="Body Text 3" w:semiHidden="1" w:unhideWhenUsed="1"/>
+    <w:lsdException w:name="Body Text Indent 2" w:semiHidden="1" w:unhideWhenUsed="1"/>
+    <w:lsdException w:name="Body Text Indent 3" w:semiHidden="1" w:unhideWhenUsed="1"/>
+    <w:lsdException w:name="Block Text" w:semiHidden="1" w:unhideWhenUsed="1"/>
+    <w:lsdException w:name="Hyperlink" w:semiHidden="1" w:unhideWhenUsed="1"/>
+    <w:lsdException w:name="FollowedHyperlink" w:semiHidden="1" w:unhideWhenUsed="1"/>
+    <w:lsdException w:name="Strong" w:uiPriority="22" w:qFormat="1"/>
+    <w:lsdException w:name="Emphasis" w:uiPriority="20" w:qFormat="1"/>
+    <w:lsdException w:name="Document Map" w:semiHidden="1" w:unhideWhenUsed="1"/>
+    <w:lsdException w:name="Plain Text" w:semiHidden="1" w:unhideWhenUsed="1"/>
+    <w:lsdException w:name="E-mail Signature" w:semiHidden="1" w:unhideWhenUsed="1"/>
+    <w:lsdException w:name="HTML Top of Form" w:semiHidden="1" w:unhideWhenUsed="1"/>
+    <w:lsdException w:name="HTML Bottom of Form" w:semiHidden="1" w:unhideWhenUsed="1"/>
+    <w:lsdException w:name="Normal (Web)" w:semiHidden="1" w:unhideWhenUsed="1"/>
+    <w:lsdException w:name="HTML Acronym" w:semiHidden="1" w:unhideWhenUsed="1"/>
+    <w:lsdException w:name="HTML Address" w:semiHidden="1" w:unhideWhenUsed="1"/>
+    <w:lsdException w:name="HTML Cite" w:semiHidden="1" w:unhideWhenUsed="1"/>
+    <w:lsdException w:name="HTML Code" w:semiHidden="1" w:unhideWhenUsed="1"/>
+    <w:lsdException w:name="HTML Definition" w:semiHidden="1" w:unhideWhenUsed="1"/>
+    <w:lsdException w:name="HTML Keyboard" w:semiHidden="1" w:unhideWhenUsed="1"/>
+    <w:lsdException w:name="HTML Preformatted" w:semiHidden="1" w:unhideWhenUsed="1"/>
+    <w:lsdException w:name="HTML Sample" w:semiHidden="1" w:unhideWhenUsed="1"/>
+    <w:lsdException w:name="HTML Typewriter" w:semiHidden="1" w:unhideWhenUsed="1"/>
+    <w:lsdException w:name="HTML Variable" w:semiHidden="1" w:unhideWhenUsed="1"/>
+    <w:lsdException w:name="Normal Table" w:semiHidden="1" w:unhideWhenUsed="1" w:qFormat="1"/>
+    <w:lsdException w:name="annotation subject" w:semiHidden="1" w:unhideWhenUsed="1"/>
+    <w:lsdException w:name="No List" w:semiHidden="1" w:unhideWhenUsed="1"/>
+    <w:lsdException w:name="Outline List 1" w:semiHidden="1" w:unhideWhenUsed="1"/>
+    <w:lsdException w:name="Outline List 2" w:semiHidden="1" w:unhideWhenUsed="1"/>
+    <w:lsdException w:name="Outline List 3" w:semiHidden="1" w:unhideWhenUsed="1"/>
+    <w:lsdException w:name="Table Simple 1" w:semiHidden="1" w:unhideWhenUsed="1"/>
+    <w:lsdException w:name="Table Simple 2" w:semiHidden="1" w:unhideWhenUsed="1"/>
+    <w:lsdException w:name="Table Simple 3" w:semiHidden="1" w:unhideWhenUsed="1"/>
+    <w:lsdException w:name="Table Classic 1" w:semiHidden="1" w:unhideWhenUsed="1"/>
+    <w:lsdException w:name="Table Classic 2" w:semiHidden="1" w:unhideWhenUsed="1"/>
+    <w:lsdException w:name="Table Classic 3" w:semiHidden="1" w:unhideWhenUsed="1"/>
+    <w:lsdException w:name="Table Classic 4" w:semiHidden="1" w:unhideWhenUsed="1"/>
+    <w:lsdException w:name="Table Colorful 1" w:semiHidden="1" w:unhideWhenUsed="1"/>
+    <w:lsdException w:name="Table Colorful 2" w:semiHidden="1" w:unhideWhenUsed="1"/>
+    <w:lsdException w:name="Table Colorful 3" w:semiHidden="1" w:unhideWhenUsed="1"/>
+    <w:lsdException w:name="Table Columns 1" w:semiHidden="1" w:unhideWhenUsed="1"/>
+    <w:lsdException w:name="Table Columns 2" w:semiHidden="1" w:unhideWhenUsed="1"/>
+    <w:lsdException w:name="Table Columns 3" w:semiHidden="1" w:unhideWhenUsed="1"/>
+    <w:lsdException w:name="Table Columns 4" w:semiHidden="1" w:unhideWhenUsed="1"/>
+    <w:lsdException w:name="Table Columns 5" w:semiHidden="1" w:unhideWhenUsed="1"/>
+    <w:lsdException w:name="Table Grid 1" w:semiHidden="1" w:unhideWhenUsed="1"/>
+    <w:lsdException w:name="Table Grid 2" w:semiHidden="1" w:unhideWhenUsed="1"/>
+    <w:lsdException w:name="Table Grid 3" w:semiHidden="1" w:unhideWhenUsed="1"/>
+    <w:lsdException w:name="Table Grid 4" w:semiHidden="1" w:unhideWhenUsed="1"/>
+    <w:lsdException w:name="Table Grid 5" w:semiHidden="1" w:unhideWhenUsed="1"/>
+    <w:lsdException w:name="Table Grid 6" w:semiHidden="1" w:unhideWhenUsed="1"/>
+    <w:lsdException w:name="Table Grid 7" w:semiHidden="1" w:unhideWhenUsed="1"/>
+    <w:lsdException w:name="Table Grid 8" w:semiHidden="1" w:unhideWhenUsed="1"/>
+    <w:lsdException w:name="Table List 1" w:semiHidden="1" w:unhideWhenUsed="1"/>
+    <w:lsdException w:name="Table List 2" w:semiHidden="1" w:unhideWhenUsed="1"/>
+    <w:lsdException w:name="Table List 3" w:semiHidden="1" w:unhideWhenUsed="1"/>
+    <w:lsdException w:name="Table List 4" w:semiHidden="1" w:unhideWhenUsed="1"/>
+    <w:lsdException w:name="Table List 5" w:semiHidden="1" w:unhideWhenUsed="1"/>
+    <w:lsdException w:name="Table List 6" w:semiHidden="1" w:unhideWhenUsed="1"/>
+    <w:lsdException w:name="Table List 7" w:semiHidden="1" w:unhideWhenUsed="1"/>
+    <w:lsdException w:name="Table List 8" w:semiHidden="1" w:unhideWhenUsed="1"/>
+    <w:lsdException w:name="Table 3D effects 1" w:semiHidden="1" w:unhideWhenUsed="1"/>
+    <w:lsdException w:name="Table 3D effects 2" w:semiHidden="1" w:unhideWhenUsed="1"/>
+    <w:lsdException w:name="Table 3D effects 3" w:semiHidden="1" w:unhideWhenUsed="1"/>
+    <w:lsdException w:name="Table Contemporary" w:semiHidden="1" w:unhideWhenUsed="1"/>
+    <w:lsdException w:name="Table Elegant" w:semiHidden="1" w:unhideWhenUsed="1"/>
+    <w:lsdException w:name="Table Professional" w:semiHidden="1" w:unhideWhenUsed="1"/>
+    <w:lsdException w:name="Table Subtle 1" w:semiHidden="1" w:unhideWhenUsed="1"/>
+    <w:lsdException w:name="Table Subtle 2" w:semiHidden="1" w:unhideWhenUsed="1"/>
+    <w:lsdException w:name="Table Web 1" w:semiHidden="1" w:unhideWhenUsed="1"/>
+    <w:lsdException w:name="Table Web 2" w:semiHidden="1" w:unhideWhenUsed="1"/>
+    <w:lsdException w:name="Table Web 3" w:semiHidden="1" w:unhideWhenUsed="1"/>
+    <w:lsdException w:name="Balloon Text" w:semiHidden="1" w:unhideWhenUsed="1"/>
+    <w:lsdException w:name="Table Grid" w:uiPriority="59" w:qFormat="1"/>
+    <w:lsdException w:name="Table Theme" w:semiHidden="1" w:unhideWhenUsed="1"/>
+    <w:lsdException w:name="Placeholder Text" w:semiHidden="1" w:unhideWhenUsed="1"/>
+    <w:lsdException w:name="No Spacing" w:semiHidden="1" w:unhideWhenUsed="1"/>
+    <w:lsdException w:name="Light Shading" w:uiPriority="60"/>
+    <w:lsdException w:name="Light List" w:uiPriority="61"/>
+    <w:lsdException w:name="Light Grid" w:uiPriority="62"/>
+    <w:lsdException w:name="Medium Shading 1" w:uiPriority="63"/>
+    <w:lsdException w:name="Medium Shading 2" w:uiPriority="64"/>
+    <w:lsdException w:name="Medium List 1" w:uiPriority="65"/>
+    <w:lsdException w:name="Medium List 2" w:uiPriority="66"/>
+    <w:lsdException w:name="Medium Grid 1" w:uiPriority="67"/>
+    <w:lsdException w:name="Medium Grid 2" w:uiPriority="68"/>
+    <w:lsdException w:name="Medium Grid 3" w:uiPriority="69"/>
+    <w:lsdException w:name="Dark List" w:uiPriority="70"/>
+    <w:lsdException w:name="Colorful Shading" w:uiPriority="71"/>
+    <w:lsdException w:name="Colorful List" w:uiPriority="72"/>
+    <w:lsdException w:name="Colorful Grid" w:uiPriority="73"/>
+    <w:lsdException w:name="Light Shading Accent 1" w:uiPriority="60"/>
+    <w:lsdException w:name="Light List Accent 1" w:uiPriority="61"/>
+    <w:lsdException w:name="Light Grid Accent 1" w:uiPriority="62"/>
+    <w:lsdException w:name="Medium Shading 1 Accent 1" w:uiPriority="63"/>
+    <w:lsdException w:name="Medium Shading 2 Accent 1" w:uiPriority="64"/>
+    <w:lsdException w:name="Medium List 1 Accent 1" w:uiPriority="65"/>
+    <w:lsdException w:name="Revision" w:semiHidden="1" w:unhideWhenUsed="1"/>
+    <w:lsdException w:name="List Paragraph" w:uiPriority="1" w:qFormat="1"/>
+    <w:lsdException w:name="Quote" w:semiHidden="1" w:unhideWhenUsed="1"/>
+    <w:lsdException w:name="Intense Quote" w:semiHidden="1" w:unhideWhenUsed="1"/>
+    <w:lsdException w:name="Medium List 2 Accent 1" w:uiPriority="66"/>
+    <w:lsdException w:name="Medium Grid 1 Accent 1" w:uiPriority="67"/>
+    <w:lsdException w:name="Medium Grid 2 Accent 1" w:uiPriority="68"/>
+    <w:lsdException w:name="Medium Grid 3 Accent 1" w:uiPriority="69"/>
+    <w:lsdException w:name="Dark List Accent 1" w:uiPriority="70"/>
+    <w:lsdException w:name="Colorful Shading Accent 1" w:uiPriority="71"/>
+    <w:lsdException w:name="Colorful List Accent 1" w:uiPriority="72"/>
+    <w:lsdException w:name="Colorful Grid Accent 1" w:uiPriority="73"/>
+    <w:lsdException w:name="Light Shading Accent 2" w:uiPriority="60"/>
+    <w:lsdException w:name="Light List Accent 2" w:uiPriority="61"/>
+    <w:lsdException w:name="Light Grid Accent 2" w:uiPriority="62"/>
+    <w:lsdException w:name="Medium Shading 1 Accent 2" w:uiPriority="63"/>
+    <w:lsdException w:name="Medium Shading 2 Accent 2" w:uiPriority="64"/>
+    <w:lsdException w:name="Medium List 1 Accent 2" w:uiPriority="65"/>
+    <w:lsdException w:name="Medium List 2 Accent 2" w:uiPriority="66"/>
+    <w:lsdException w:name="Medium Grid 1 Accent 2" w:uiPriority="67"/>
+    <w:lsdException w:name="Medium Grid 2 Accent 2" w:uiPriority="68"/>
+    <w:lsdException w:name="Medium Grid 3 Accent 2" w:uiPriority="69"/>
+    <w:lsdException w:name="Dark List Accent 2" w:uiPriority="70"/>
+    <w:lsdException w:name="Colorful Shading Accent 2" w:uiPriority="71"/>
+    <w:lsdException w:name="Colorful List Accent 2" w:uiPriority="72"/>
+    <w:lsdException w:name="Colorful Grid Accent 2" w:uiPriority="73"/>
+    <w:lsdException w:name="Light Shading Accent 3" w:uiPriority="60"/>
+    <w:lsdException w:name="Light List Accent 3" w:uiPriority="61"/>
+    <w:lsdException w:name="Light Grid Accent 3" w:uiPriority="62"/>
+    <w:lsdException w:name="Medium Shading 1 Accent 3" w:uiPriority="63"/>
+    <w:lsdException w:name="Medium Shading 2 Accent 3" w:uiPriority="64"/>
+    <w:lsdException w:name="Medium List 1 Accent 3" w:uiPriority="65"/>
+    <w:lsdException w:name="Medium List 2 Accent 3" w:uiPriority="66"/>
+    <w:lsdException w:name="Medium Grid 1 Accent 3" w:uiPriority="67"/>
+    <w:lsdException w:name="Medium Grid 2 Accent 3" w:uiPriority="68"/>
+    <w:lsdException w:name="Medium Grid 3 Accent 3" w:uiPriority="69"/>
+    <w:lsdException w:name="Dark List Accent 3" w:uiPriority="70"/>
+    <w:lsdException w:name="Colorful Shading Accent 3" w:uiPriority="71"/>
+    <w:lsdException w:name="Colorful List Accent 3" w:uiPriority="72"/>
+    <w:lsdException w:name="Colorful Grid Accent 3" w:uiPriority="73"/>
+    <w:lsdException w:name="Light Shading Accent 4" w:uiPriority="60"/>
+    <w:lsdException w:name="Light List Accent 4" w:uiPriority="61"/>
+    <w:lsdException w:name="Light Grid Accent 4" w:uiPriority="62"/>
+    <w:lsdException w:name="Medium Shading 1 Accent 4" w:uiPriority="63"/>
+    <w:lsdException w:name="Medium Shading 2 Accent 4" w:uiPriority="64"/>
+    <w:lsdException w:name="Medium List 1 Accent 4" w:uiPriority="65"/>
+    <w:lsdException w:name="Medium List 2 Accent 4" w:uiPriority="66"/>
+    <w:lsdException w:name="Medium Grid 1 Accent 4" w:uiPriority="67"/>
+    <w:lsdException w:name="Medium Grid 2 Accent 4" w:uiPriority="68"/>
+    <w:lsdException w:name="Medium Grid 3 Accent 4" w:uiPriority="69"/>
+    <w:lsdException w:name="Dark List Accent 4" w:uiPriority="70"/>
+    <w:lsdException w:name="Colorful Shading Accent 4" w:uiPriority="71"/>
+    <w:lsdException w:name="Colorful List Accent 4" w:uiPriority="72"/>
+    <w:lsdException w:name="Colorful Grid Accent 4" w:uiPriority="73"/>
+    <w:lsdException w:name="Light Shading Accent 5" w:uiPriority="60"/>
+    <w:lsdException w:name="Light List Accent 5" w:uiPriority="61"/>
+    <w:lsdException w:name="Light Grid Accent 5" w:uiPriority="62"/>
+    <w:lsdException w:name="Medium Shading 1 Accent 5" w:uiPriority="63"/>
+    <w:lsdException w:name="Medium Shading 2 Accent 5" w:uiPriority="64"/>
+    <w:lsdException w:name="Medium List 1 Accent 5" w:uiPriority="65"/>
+    <w:lsdException w:name="Medium List 2 Accent 5" w:uiPriority="66"/>
+    <w:lsdException w:name="Medium Grid 1 Accent 5" w:uiPriority="67"/>
+    <w:lsdException w:name="Medium Grid 2 Accent 5" w:uiPriority="68"/>
+    <w:lsdException w:name="Medium Grid 3 Accent 5" w:uiPriority="69"/>
+    <w:lsdException w:name="Dark List Accent 5" w:uiPriority="70"/>
+    <w:lsdException w:name="Colorful Shading Accent 5" w:uiPriority="71"/>
+    <w:lsdException w:name="Colorful List Accent 5" w:uiPriority="72"/>
+    <w:lsdException w:name="Colorful Grid Accent 5" w:uiPriority="73"/>
+    <w:lsdException w:name="Light Shading Accent 6" w:uiPriority="60"/>
+    <w:lsdException w:name="Light List Accent 6" w:uiPriority="61"/>
+    <w:lsdException w:name="Light Grid Accent 6" w:uiPriority="62"/>
+    <w:lsdException w:name="Medium Shading 1 Accent 6" w:uiPriority="63"/>
+    <w:lsdException w:name="Medium Shading 2 Accent 6" w:uiPriority="64"/>
+    <w:lsdException w:name="Medium List 1 Accent 6" w:uiPriority="65"/>
+    <w:lsdException w:name="Medium List 2 Accent 6" w:uiPriority="66"/>
+    <w:lsdException w:name="Medium Grid 1 Accent 6" w:uiPriority="67"/>
+    <w:lsdException w:name="Medium Grid 2 Accent 6" w:uiPriority="68"/>
+    <w:lsdException w:name="Medium Grid 3 Accent 6" w:uiPriority="69"/>
+    <w:lsdException w:name="Dark List Accent 6" w:uiPriority="70"/>
+    <w:lsdException w:name="Colorful Shading Accent 6" w:uiPriority="71"/>
+    <w:lsdException w:name="Colorful List Accent 6" w:uiPriority="72"/>
+    <w:lsdException w:name="Colorful Grid Accent 6" w:uiPriority="73"/>
+    <w:lsdException w:name="Subtle Emphasis" w:uiPriority="19" w:qFormat="1"/>
+    <w:lsdException w:name="Intense Emphasis" w:uiPriority="21" w:qFormat="1"/>
+    <w:lsdException w:name="Subtle Reference" w:uiPriority="31" w:qFormat="1"/>
+    <w:lsdException w:name="Intense Reference" w:uiPriority="32" w:qFormat="1"/>
+    <w:lsdException w:name="Book Title" w:uiPriority="33" w:qFormat="1"/>
+    <w:lsdException w:name="Bibliography" w:semiHidden="1" w:uiPriority="37" w:unhideWhenUsed="1"/>
+    <w:lsdException w:name="TOC Heading" w:semiHidden="1" w:uiPriority="39" w:unhideWhenUsed="1" w:qFormat="1"/>
+    <w:lsdException w:name="Plain Table 1" w:uiPriority="41"/>
+    <w:lsdException w:name="Plain Table 2" w:uiPriority="42"/>
+    <w:lsdException w:name="Plain Table 3" w:uiPriority="43"/>
+    <w:lsdException w:name="Plain Table 4" w:uiPriority="44"/>
+    <w:lsdException w:name="Plain Table 5" w:uiPriority="45"/>
+    <w:lsdException w:name="Grid Table Light" w:uiPriority="40"/>
+    <w:lsdException w:name="Grid Table 1 Light" w:uiPriority="46"/>
+    <w:lsdException w:name="Grid Table 2" w:uiPriority="47"/>
+    <w:lsdException w:name="Grid Table 3" w:uiPriority="48"/>
+    <w:lsdException w:name="Grid Table 4" w:uiPriority="49"/>
+    <w:lsdException w:name="Grid Table 5 Dark" w:uiPriority="50"/>
+    <w:lsdException w:name="Grid Table 6 Colorful" w:uiPriority="51"/>
+    <w:lsdException w:name="Grid Table 7 Colorful" w:uiPriority="52"/>
+    <w:lsdException w:name="Grid Table 1 Light Accent 1" w:uiPriority="46"/>
+    <w:lsdException w:name="Grid Table 2 Accent 1" w:uiPriority="47"/>
+    <w:lsdException w:name="Grid Table 3 Accent 1" w:uiPriority="48"/>
+    <w:lsdException w:name="Grid Table 4 Accent 1" w:uiPriority="49"/>
+    <w:lsdException w:name="Grid Table 5 Dark Accent 1" w:uiPriority="50"/>
+    <w:lsdException w:name="Grid Table 6 Colorful Accent 1" w:uiPriority="51"/>
+    <w:lsdException w:name="Grid Table 7 Colorful Accent 1" w:uiPriority="52"/>
+    <w:lsdException w:name="Grid Table 1 Light Accent 2" w:uiPriority="46"/>
+    <w:lsdException w:name="Grid Table 2 Accent 2" w:uiPriority="47"/>
+    <w:lsdException w:name="Grid Table 3 Accent 2" w:uiPriority="48"/>
+    <w:lsdException w:name="Grid Table 4 Accent 2" w:uiPriority="49"/>
+    <w:lsdException w:name="Grid Table 5 Dark Accent 2" w:uiPriority="50"/>
+    <w:lsdException w:name="Grid Table 6 Colorful Accent 2" w:uiPriority="51"/>
+    <w:lsdException w:name="Grid Table 7 Colorful Accent 2" w:uiPriority="52"/>
+    <w:lsdException w:name="Grid Table 1 Light Accent 3" w:uiPriority="46"/>
+    <w:lsdException w:name="Grid Table 2 Accent 3" w:uiPriority="47"/>
+    <w:lsdException w:name="Grid Table 3 Accent 3" w:uiPriority="48"/>
+    <w:lsdException w:name="Grid Table 4 Accent 3" w:uiPriority="49"/>
+    <w:lsdException w:name="Grid Table 5 Dark Accent 3" w:uiPriority="50"/>
+    <w:lsdException w:name="Grid Table 6 Colorful Accent 3" w:uiPriority="51"/>
+    <w:lsdException w:name="Grid Table 7 Colorful Accent 3" w:uiPriority="52"/>
+    <w:lsdException w:name="Grid Table 1 Light Accent 4" w:uiPriority="46"/>
+    <w:lsdException w:name="Grid Table 2 Accent 4" w:uiPriority="47"/>
+    <w:lsdException w:name="Grid Table 3 Accent 4" w:uiPriority="48"/>
+    <w:lsdException w:name="Grid Table 4 Accent 4" w:uiPriority="49"/>
+    <w:lsdException w:name="Grid Table 5 Dark Accent 4" w:uiPriority="50"/>
+    <w:lsdException w:name="Grid Table 6 Colorful Accent 4" w:uiPriority="51"/>
+    <w:lsdException w:name="Grid Table 7 Colorful Accent 4" w:uiPriority="52"/>
+    <w:lsdException w:name="Grid Table 1 Light Accent 5" w:uiPriority="46"/>
+    <w:lsdException w:name="Grid Table 2 Accent 5" w:uiPriority="47"/>
+    <w:lsdException w:name="Grid Table 3 Accent 5" w:uiPriority="48"/>
+    <w:lsdException w:name="Grid Table 4 Accent 5" w:uiPriority="49"/>
+    <w:lsdException w:name="Grid Table 5 Dark Accent 5" w:uiPriority="50"/>
+    <w:lsdException w:name="Grid Table 6 Colorful Accent 5" w:uiPriority="51"/>
+    <w:lsdException w:name="Grid Table 7 Colorful Accent 5" w:uiPriority="52"/>
+    <w:lsdException w:name="Grid Table 1 Light Accent 6" w:uiPriority="46"/>
+    <w:lsdException w:name="Grid Table 2 Accent 6" w:uiPriority="47"/>
+    <w:lsdException w:name="Grid Table 3 Accent 6" w:uiPriority="48"/>
+    <w:lsdException w:name="Grid Table 4 Accent 6" w:uiPriority="49"/>
+    <w:lsdException w:name="Grid Table 5 Dark Accent 6" w:uiPriority="50"/>
+    <w:lsdException w:name="Grid Table 6 Colorful Accent 6" w:uiPriority="51"/>
+    <w:lsdException w:name="Grid Table 7 Colorful Accent 6" w:uiPriority="52"/>
+    <w:lsdException w:name="List Table 1 Light" w:uiPriority="46"/>
+    <w:lsdException w:name="List Table 2" w:uiPriority="47"/>
+    <w:lsdException w:name="List Table 3" w:uiPriority="48"/>
+    <w:lsdException w:name="List Table 4" w:uiPriority="49"/>
+    <w:lsdException w:name="List Table 5 Dark" w:uiPriority="50"/>
+    <w:lsdException w:name="List Table 6 Colorful" w:uiPriority="51"/>
+    <w:lsdException w:name="List Table 7 Colorful" w:uiPriority="52"/>
+    <w:lsdException w:name="List Table 1 Light Accent 1" w:uiPriority="46"/>
+    <w:lsdException w:name="List Table 2 Accent 1" w:uiPriority="47"/>
+    <w:lsdException w:name="List Table 3 Accent 1" w:uiPriority="48"/>
+    <w:lsdException w:name="List Table 4 Accent 1" w:uiPriority="49"/>
+    <w:lsdException w:name="List Table 5 Dark Accent 1" w:uiPriority="50"/>
+    <w:lsdException w:name="List Table 6 Colorful Accent 1" w:uiPriority="51"/>
+    <w:lsdException w:name="List Table 7 Colorful Accent 1" w:uiPriority="52"/>
+    <w:lsdException w:name="List Table 1 Light Accent 2" w:uiPriority="46"/>
+    <w:lsdException w:name="List Table 2 Accent 2" w:uiPriority="47"/>
+    <w:lsdException w:name="List Table 3 Accent 2" w:uiPriority="48"/>
+    <w:lsdException w:name="List Table 4 Accent 2" w:uiPriority="49"/>
+    <w:lsdException w:name="List Table 5 Dark Accent 2" w:uiPriority="50"/>
+    <w:lsdException w:name="List Table 6 Colorful Accent 2" w:uiPriority="51"/>
+    <w:lsdException w:name="List Table 7 Colorful Accent 2" w:uiPriority="52"/>
+    <w:lsdException w:name="List Table 1 Light Accent 3" w:uiPriority="46"/>
+    <w:lsdException w:name="List Table 2 Accent 3" w:uiPriority="47"/>
+    <w:lsdException w:name="List Table 3 Accent 3" w:uiPriority="48"/>
+    <w:lsdException w:name="List Table 4 Accent 3" w:uiPriority="49"/>
+    <w:lsdException w:name="List Table 5 Dark Accent 3" w:uiPriority="50"/>
+    <w:lsdException w:name="List Table 6 Colorful Accent 3" w:uiPriority="51"/>
+    <w:lsdException w:name="List Table 7 Colorful Accent 3" w:uiPriority="52"/>
+    <w:lsdException w:name="List Table 1 Light Accent 4" w:uiPriority="46"/>
+    <w:lsdException w:name="List Table 2 Accent 4" w:uiPriority="47"/>
+    <w:lsdException w:name="List Table 3 Accent 4" w:uiPriority="48"/>
+    <w:lsdException w:name="List Table 4 Accent 4" w:uiPriority="49"/>
+    <w:lsdException w:name="List Table 5 Dark Accent 4" w:uiPriority="50"/>
+    <w:lsdException w:name="List Table 6 Colorful Accent 4" w:uiPriority="51"/>
+    <w:lsdException w:name="List Table 7 Colorful Accent 4" w:uiPriority="52"/>
+    <w:lsdException w:name="List Table 1 Light Accent 5" w:uiPriority="46"/>
+    <w:lsdException w:name="List Table 2 Accent 5" w:uiPriority="47"/>
+    <w:lsdException w:name="List Table 3 Accent 5" w:uiPriority="48"/>
+    <w:lsdException w:name="List Table 4 Accent 5" w:uiPriority="49"/>
+    <w:lsdException w:name="List Table 5 Dark Accent 5" w:uiPriority="50"/>
+    <w:lsdException w:name="List Table 6 Colorful Accent 5" w:uiPriority="51"/>
+    <w:lsdException w:name="List Table 7 Colorful Accent 5" w:uiPriority="52"/>
+    <w:lsdException w:name="List Table 1 Light Accent 6" w:uiPriority="46"/>
+    <w:lsdException w:name="List Table 2 Accent 6" w:uiPriority="47"/>
+    <w:lsdException w:name="List Table 3 Accent 6" w:uiPriority="48"/>
+    <w:lsdException w:name="List Table 4 Accent 6" w:uiPriority="49"/>
+    <w:lsdException w:name="List Table 5 Dark Accent 6" w:uiPriority="50"/>
+    <w:lsdException w:name="List Table 6 Colorful Accent 6" w:uiPriority="51"/>
+    <w:lsdException w:name="List Table 7 Colorful Accent 6" w:uiPriority="52"/>
+    <w:lsdException w:name="Mention" w:semiHidden="1" w:unhideWhenUsed="1"/>
+    <w:lsdException w:name="Smart Hyperlink" w:semiHidden="1" w:unhideWhenUsed="1"/>
+    <w:lsdException w:name="Hashtag" w:semiHidden="1" w:unhideWhenUsed="1"/>
+    <w:lsdException w:name="Unresolved Mention" w:semiHidden="1" w:unhideWhenUsed="1"/>
+    <w:lsdException w:name="Smart Link" w:semiHidden="1" w:unhideWhenUsed="1"/>
   </w:latentStyles>
-  <w:style w:type="paragraph" w:default="1" w:styleId="1">
+  <w:style w:type="paragraph" w:default="1" w:styleId="Normal">
     <w:name w:val="Normal"/>
+    <w:uiPriority w:val="1"/>
     <w:qFormat/>
-    <w:uiPriority w:val="1"/>
     <w:pPr>
       <w:widowControl w:val="0"/>
       <w:autoSpaceDE w:val="0"/>
       <w:autoSpaceDN w:val="0"/>
     </w:pPr>
     <w:rPr>
-      <w:rFonts w:asciiTheme="minorHAnsi" w:hAnsiTheme="minorHAnsi" w:eastAsiaTheme="minorHAnsi" w:cstheme="minorBidi"/>
       <w:sz w:val="22"/>
       <w:szCs w:val="22"/>
-      <w:lang w:val="en-US" w:eastAsia="en-US" w:bidi="ar-SA"/>
+      <w:lang w:val="en-US" w:eastAsia="en-US"/>
     </w:rPr>
   </w:style>
-  <w:style w:type="character" w:default="1" w:styleId="2">
+  <w:style w:type="character" w:default="1" w:styleId="DefaultParagraphFont">
     <w:name w:val="Default Paragraph Font"/>
+    <w:uiPriority w:val="1"/>
     <w:semiHidden/>
     <w:unhideWhenUsed/>
-    <w:qFormat/>
-    <w:uiPriority w:val="1"/>
   </w:style>
-  <w:style w:type="table" w:default="1" w:styleId="3">
+  <w:style w:type="table" w:default="1" w:styleId="TableNormal">
     <w:name w:val="Normal Table"/>
+    <w:uiPriority w:val="99"/>
     <w:semiHidden/>
     <w:unhideWhenUsed/>
-    <w:qFormat/>
-    <w:uiPriority w:val="99"/>
     <w:tblPr>
+      <w:tblInd w:w="0" w:type="dxa"/>
       <w:tblCellMar>
         <w:top w:w="0" w:type="dxa"/>
         <w:left w:w="108" w:type="dxa"/>
@@ -3724,39 +3683,45 @@
       </w:tblCellMar>
     </w:tblPr>
   </w:style>
-  <w:style w:type="table" w:styleId="4">
+  <w:style w:type="numbering" w:default="1" w:styleId="NoList">
+    <w:name w:val="No List"/>
+    <w:uiPriority w:val="99"/>
+    <w:semiHidden/>
+    <w:unhideWhenUsed/>
+  </w:style>
+  <w:style w:type="table" w:styleId="TableGrid">
     <w:name w:val="Table Grid"/>
-    <w:basedOn w:val="3"/>
+    <w:basedOn w:val="TableNormal"/>
+    <w:uiPriority w:val="59"/>
     <w:qFormat/>
-    <w:uiPriority w:val="59"/>
     <w:pPr>
       <w:widowControl w:val="0"/>
       <w:jc w:val="both"/>
     </w:pPr>
     <w:tblPr>
       <w:tblBorders>
-        <w:top w:val="single" w:color="auto" w:sz="4" w:space="0"/>
-        <w:left w:val="single" w:color="auto" w:sz="4" w:space="0"/>
-        <w:bottom w:val="single" w:color="auto" w:sz="4" w:space="0"/>
-        <w:right w:val="single" w:color="auto" w:sz="4" w:space="0"/>
-        <w:insideH w:val="single" w:color="auto" w:sz="4" w:space="0"/>
-        <w:insideV w:val="single" w:color="auto" w:sz="4" w:space="0"/>
+        <w:top w:val="single" w:sz="4" w:space="0" w:color="auto"/>
+        <w:left w:val="single" w:sz="4" w:space="0" w:color="auto"/>
+        <w:bottom w:val="single" w:sz="4" w:space="0" w:color="auto"/>
+        <w:right w:val="single" w:sz="4" w:space="0" w:color="auto"/>
+        <w:insideH w:val="single" w:sz="4" w:space="0" w:color="auto"/>
+        <w:insideV w:val="single" w:sz="4" w:space="0" w:color="auto"/>
       </w:tblBorders>
     </w:tblPr>
   </w:style>
-  <w:style w:type="paragraph" w:styleId="5">
+  <w:style w:type="paragraph" w:styleId="ListParagraph">
     <w:name w:val="List Paragraph"/>
-    <w:basedOn w:val="1"/>
+    <w:basedOn w:val="Normal"/>
+    <w:uiPriority w:val="1"/>
     <w:qFormat/>
+  </w:style>
+  <w:style w:type="paragraph" w:customStyle="1" w:styleId="TableParagraph">
+    <w:name w:val="Table Paragraph"/>
+    <w:basedOn w:val="Normal"/>
     <w:uiPriority w:val="1"/>
-  </w:style>
-  <w:style w:type="paragraph" w:customStyle="1" w:styleId="6">
-    <w:name w:val="Table Paragraph"/>
-    <w:basedOn w:val="1"/>
     <w:qFormat/>
-    <w:uiPriority w:val="1"/>
     <w:rPr>
-      <w:rFonts w:ascii="Arial MT" w:hAnsi="Arial MT" w:eastAsia="Arial MT" w:cs="Arial MT"/>
+      <w:rFonts w:ascii="Arial MT" w:eastAsia="Arial MT" w:hAnsi="Arial MT" w:cs="Arial MT"/>
     </w:rPr>
   </w:style>
 </w:styles>
@@ -4041,5 +4006,6 @@
     </a:fmtScheme>
   </a:themeElements>
   <a:objectDefaults/>
+  <a:extraClrSchemeLst/>
 </a:theme>
 </file>
</xml_diff>

<commit_message>
Enforce preamble strictly to 'I/We Claim,' in Form2GeneratorService
</commit_message>
<xml_diff>
--- a/backend sp/demo/src/main/resources/Form28MAIN.docx
+++ b/backend sp/demo/src/main/resources/Form28MAIN.docx
@@ -912,27 +912,6 @@
                       <w:sz w:val="18"/>
                       <w:szCs w:val="18"/>
                     </w:rPr>
-                    <w:t>{{SERVICE_NAME}}</w:t>
-                  </w:r>
-                </w:p>
-                <w:p>
-                  <w:pPr>
-                    <w:pStyle w:val="TableParagraph"/>
-                    <w:spacing w:before="38"/>
-                    <w:rPr>
-                      <w:rFonts w:ascii="Calibri" w:hAnsi="Calibri" w:cs="Calibri"/>
-                      <w:bCs/>
-                      <w:sz w:val="18"/>
-                      <w:szCs w:val="18"/>
-                    </w:rPr>
-                  </w:pPr>
-                  <w:r>
-                    <w:rPr>
-                      <w:rFonts w:ascii="Calibri" w:hAnsi="Calibri" w:cs="Calibri"/>
-                      <w:bCs/>
-                      <w:sz w:val="18"/>
-                      <w:szCs w:val="18"/>
-                    </w:rPr>
                     <w:t>{{SERVICE_ADDRESS}}</w:t>
                   </w:r>
                 </w:p>
@@ -1064,39 +1043,13 @@
               </w:rPr>
               <w:t xml:space="preserve"> </w:t>
             </w:r>
-            <w:proofErr w:type="gramStart"/>
-            <w:r>
-              <w:rPr>
-                <w:rFonts w:ascii="Arial"/>
-                <w:b/>
-                <w:w w:val="80"/>
-              </w:rPr>
-              <w:t xml:space="preserve">   </w:t>
-            </w:r>
-            <w:r>
-              <w:rPr>
-                <w:rFonts w:ascii="Arial"/>
-                <w:b/>
-                <w:w w:val="80"/>
-              </w:rPr>
-              <w:t>{principal}</w:t>
-            </w:r>
-            <w:r>
-              <w:rPr>
-                <w:rFonts w:ascii="Arial"/>
-                <w:b/>
-                <w:w w:val="80"/>
-              </w:rPr>
-              <w:t xml:space="preserve">   </w:t>
-            </w:r>
-            <w:proofErr w:type="gramEnd"/>
-            <w:r>
-              <w:rPr>
-                <w:rFonts w:ascii="Arial"/>
-                <w:b/>
-                <w:w w:val="80"/>
-              </w:rPr>
-              <w:t xml:space="preserve">    </w:t>
+            <w:r>
+              <w:rPr>
+                <w:rFonts w:ascii="Arial"/>
+                <w:b/>
+                <w:w w:val="80"/>
+              </w:rPr>
+              <w:t xml:space="preserve">   {principal}       </w:t>
             </w:r>
             <w:r>
               <w:rPr>
@@ -1339,15 +1292,7 @@
                 <w:spacing w:val="-2"/>
                 <w:w w:val="80"/>
               </w:rPr>
-              <w:t>su</w:t>
-            </w:r>
-            <w:r>
-              <w:rPr>
-                <w:color w:val="444444"/>
-                <w:spacing w:val="-2"/>
-                <w:w w:val="80"/>
-              </w:rPr>
-              <w:t>bmitted</w:t>
+              <w:t>submitted</w:t>
             </w:r>
           </w:p>
           <w:p>
@@ -2412,25 +2357,7 @@
                 <w:spacing w:val="-2"/>
                 <w:w w:val="85"/>
               </w:rPr>
-              <w:t xml:space="preserve">of India, Approval Attached and Anna University, Govt of </w:t>
-            </w:r>
-            <w:proofErr w:type="spellStart"/>
-            <w:r>
-              <w:rPr>
-                <w:color w:val="444444"/>
-                <w:spacing w:val="-2"/>
-                <w:w w:val="85"/>
-              </w:rPr>
-              <w:t>Tamilnadu</w:t>
-            </w:r>
-            <w:proofErr w:type="spellEnd"/>
-            <w:r>
-              <w:rPr>
-                <w:color w:val="444444"/>
-                <w:spacing w:val="-2"/>
-                <w:w w:val="85"/>
-              </w:rPr>
-              <w:t xml:space="preserve"> Letter Attached.</w:t>
+              <w:t>of India, Approval Attached and Anna University, Govt of Tamilnadu Letter Attached.</w:t>
             </w:r>
           </w:p>
           <w:p>
@@ -2729,23 +2656,7 @@
                 <w:rFonts w:ascii="Arial"/>
                 <w:b/>
               </w:rPr>
-              <w:t xml:space="preserve">                {</w:t>
-            </w:r>
-            <w:proofErr w:type="spellStart"/>
-            <w:r>
-              <w:rPr>
-                <w:rFonts w:ascii="Arial"/>
-                <w:b/>
-              </w:rPr>
-              <w:t>clg_name</w:t>
-            </w:r>
-            <w:proofErr w:type="spellEnd"/>
-            <w:r>
-              <w:rPr>
-                <w:rFonts w:ascii="Arial"/>
-                <w:b/>
-              </w:rPr>
-              <w:t>}</w:t>
+              <w:t xml:space="preserve">                {clg_name}</w:t>
             </w:r>
           </w:p>
           <w:p>
@@ -3103,15 +3014,7 @@
                 <w:b/>
                 <w:w w:val="80"/>
               </w:rPr>
-              <w:t>Office,</w:t>
-            </w:r>
-            <w:r>
-              <w:rPr>
-                <w:rFonts w:ascii="Arial"/>
-                <w:b/>
-                <w:w w:val="80"/>
-              </w:rPr>
-              <w:t xml:space="preserve"> Chennai</w:t>
+              <w:t>Office, Chennai</w:t>
             </w:r>
           </w:p>
         </w:tc>

</xml_diff>